<commit_message>
Perbarui 6 RPS ke versi baru + tambah 2 RPS baru (tanpa dobel)
Dari unggahan 8 file RPS:
- 6 diganti versi baru yang jauh lebih lengkap (210-225KB, format
  baru) menimpa file lama 33-43KB dengan nama tetap: KKN,
  Kewirausahaan II Coaching, Manajemen Ziswaf, Pasar Modal (Format
  Baru), Perekonomian Indonesia, Scale Up UMKM (Format Baru)
- 2 baru: Ready Journey (Ganjil 2026/2027) dan Studi Al-Qur'an I,
  ditambahkan alfabetis di klaster Semester Ini
Counter: Semester Ini 60->62, RPS 75->77, total 82->84 (kartu
dashboard ikut). Manifest 1.001->1.003. Verifikasi 1.199 href valid.

Co-Authored-By: Claude Fable 5 <noreply@anthropic.com>
Claude-Session: https://claude.ai/code/session_01D4n1voPRW4FGxKhu4rfT9G
</commit_message>
<xml_diff>
--- a/1. AKREDITASI & REGULASI/Akreditasi versi revisi/AKREDITASI STEIFI 2027/RPS MK/semester ini/RPS_Pasar_Modal_Format_Baru_20262.docx
+++ b/1. AKREDITASI & REGULASI/Akreditasi versi revisi/AKREDITASI STEIFI 2027/RPS MK/semester ini/RPS_Pasar_Modal_Format_Baru_20262.docx
@@ -1,6 +1,6 @@
 
 <file path=word/document.xml><?xml version="1.0" encoding="utf-8"?>
-<w:document xmlns:wpc="http://schemas.microsoft.com/office/word/2010/wordprocessingCanvas" xmlns:cx="http://schemas.microsoft.com/office/drawing/2014/chartex" xmlns:cx1="http://schemas.microsoft.com/office/drawing/2015/9/8/chartex" xmlns:cx2="http://schemas.microsoft.com/office/drawing/2015/10/21/chartex" xmlns:cx3="http://schemas.microsoft.com/office/drawing/2016/5/9/chartex" xmlns:cx4="http://schemas.microsoft.com/office/drawing/2016/5/10/chartex" xmlns:cx5="http://schemas.microsoft.com/office/drawing/2016/5/11/chartex" xmlns:cx6="http://schemas.microsoft.com/office/drawing/2016/5/12/chartex" xmlns:cx7="http://schemas.microsoft.com/office/drawing/2016/5/13/chartex" xmlns:cx8="http://schemas.microsoft.com/office/drawing/2016/5/14/chartex" xmlns:mc="http://schemas.openxmlformats.org/markup-compatibility/2006" xmlns:aink="http://schemas.microsoft.com/office/drawing/2016/ink" xmlns:am3d="http://schemas.microsoft.com/office/drawing/2017/model3d" xmlns:o="urn:schemas-microsoft-com:office:office" xmlns:oel="http://schemas.microsoft.com/office/2019/extlst" xmlns:r="http://schemas.openxmlformats.org/officeDocument/2006/relationships" xmlns:m="http://schemas.openxmlformats.org/officeDocument/2006/math" xmlns:v="urn:schemas-microsoft-com:vml" xmlns:wp14="http://schemas.microsoft.com/office/word/2010/wordprocessingDrawing" xmlns:wp="http://schemas.openxmlformats.org/drawingml/2006/wordprocessingDrawing" xmlns:w10="urn:schemas-microsoft-com:office:word" xmlns:w="http://schemas.openxmlformats.org/wordprocessingml/2006/main" xmlns:w14="http://schemas.microsoft.com/office/word/2010/wordml" xmlns:w15="http://schemas.microsoft.com/office/word/2012/wordml" xmlns:w16cei="http://schemas.microsoft.com/office/word/2026/wordml/cei" xmlns:w16cex="http://schemas.microsoft.com/office/word/2018/wordml/cex" xmlns:w16cid="http://schemas.microsoft.com/office/word/2016/wordml/cid" xmlns:w16="http://schemas.microsoft.com/office/word/2018/wordml" xmlns:w16du="http://schemas.microsoft.com/office/word/2023/wordml/word16du" xmlns:w16sdtdh="http://schemas.microsoft.com/office/word/2020/wordml/sdtdatahash" xmlns:w16sdtfl="http://schemas.microsoft.com/office/word/2024/wordml/sdtformatlock" xmlns:w16se="http://schemas.microsoft.com/office/word/2015/wordml/symex" xmlns:wpg="http://schemas.microsoft.com/office/word/2010/wordprocessingGroup" xmlns:wpi="http://schemas.microsoft.com/office/word/2010/wordprocessingInk" xmlns:wne="http://schemas.microsoft.com/office/word/2006/wordml" xmlns:wps="http://schemas.microsoft.com/office/word/2010/wordprocessingShape" mc:Ignorable="w14 w15 w16se w16cid w16 w16cex w16sdtdh w16sdtfl w16du wp14">
+<w:document xmlns:wpc="http://schemas.microsoft.com/office/word/2010/wordprocessingCanvas" xmlns:cx="http://schemas.microsoft.com/office/drawing/2014/chartex" xmlns:cx1="http://schemas.microsoft.com/office/drawing/2015/9/8/chartex" xmlns:cx2="http://schemas.microsoft.com/office/drawing/2015/10/21/chartex" xmlns:cx3="http://schemas.microsoft.com/office/drawing/2016/5/9/chartex" xmlns:cx4="http://schemas.microsoft.com/office/drawing/2016/5/10/chartex" xmlns:cx5="http://schemas.microsoft.com/office/drawing/2016/5/11/chartex" xmlns:cx6="http://schemas.microsoft.com/office/drawing/2016/5/12/chartex" xmlns:cx7="http://schemas.microsoft.com/office/drawing/2016/5/13/chartex" xmlns:cx8="http://schemas.microsoft.com/office/drawing/2016/5/14/chartex" xmlns:mc="http://schemas.openxmlformats.org/markup-compatibility/2006" xmlns:aink="http://schemas.microsoft.com/office/drawing/2016/ink" xmlns:am3d="http://schemas.microsoft.com/office/drawing/2017/model3d" xmlns:o="urn:schemas-microsoft-com:office:office" xmlns:oel="http://schemas.microsoft.com/office/2019/extlst" xmlns:r="http://schemas.openxmlformats.org/officeDocument/2006/relationships" xmlns:m="http://schemas.openxmlformats.org/officeDocument/2006/math" xmlns:v="urn:schemas-microsoft-com:vml" xmlns:wp14="http://schemas.microsoft.com/office/word/2010/wordprocessingDrawing" xmlns:wp="http://schemas.openxmlformats.org/drawingml/2006/wordprocessingDrawing" xmlns:w10="urn:schemas-microsoft-com:office:word" xmlns:w="http://schemas.openxmlformats.org/wordprocessingml/2006/main" xmlns:w14="http://schemas.microsoft.com/office/word/2010/wordml" xmlns:w15="http://schemas.microsoft.com/office/word/2012/wordml" xmlns:w16cex="http://schemas.microsoft.com/office/word/2018/wordml/cex" xmlns:w16cid="http://schemas.microsoft.com/office/word/2016/wordml/cid" xmlns:w16="http://schemas.microsoft.com/office/word/2018/wordml" xmlns:w16du="http://schemas.microsoft.com/office/word/2023/wordml/word16du" xmlns:w16sdtdh="http://schemas.microsoft.com/office/word/2020/wordml/sdtdatahash" xmlns:w16sdtfl="http://schemas.microsoft.com/office/word/2024/wordml/sdtformatlock" xmlns:w16se="http://schemas.microsoft.com/office/word/2015/wordml/symex" xmlns:wpg="http://schemas.microsoft.com/office/word/2010/wordprocessingGroup" xmlns:wpi="http://schemas.microsoft.com/office/word/2010/wordprocessingInk" xmlns:wne="http://schemas.microsoft.com/office/word/2006/wordml" xmlns:wps="http://schemas.microsoft.com/office/word/2010/wordprocessingShape" mc:Ignorable="w14 w15 w16se w16cid w16 w16cex w16sdtdh w16sdtfl w16du wp14">
   <w:body>
     <w:tbl>
       <w:tblPr>
@@ -17,7 +17,7 @@
           <w:left w:w="10" w:type="dxa"/>
           <w:right w:w="10" w:type="dxa"/>
         </w:tblCellMar>
-        <w:tblLook w:val="04A0" w:firstRow="1" w:lastRow="0" w:firstColumn="1" w:lastColumn="0" w:noHBand="0" w:noVBand="1"/>
+        <w:tblLook w:val="0000" w:firstRow="0" w:lastRow="0" w:firstColumn="0" w:lastColumn="0" w:noHBand="0" w:noVBand="0"/>
       </w:tblPr>
       <w:tblGrid>
         <w:gridCol w:w="1661"/>
@@ -61,7 +61,7 @@
                 <w:noProof/>
               </w:rPr>
               <w:drawing>
-                <wp:inline distT="0" distB="0" distL="0" distR="0" wp14:anchorId="1004CE51" wp14:editId="236BAFC0">
+                <wp:inline distT="0" distB="0" distL="0" distR="0" wp14:anchorId="3754870E" wp14:editId="40CDE4E6">
                   <wp:extent cx="857250" cy="857250"/>
                   <wp:effectExtent l="0" t="0" r="0" b="0"/>
                   <wp:docPr id="1" name="Picture 1"/>
@@ -304,7 +304,7 @@
                 <w:sz w:val="21"/>
                 <w:szCs w:val="21"/>
               </w:rPr>
-              <w:t>MKI11321</w:t>
+              <w:t>MKI11305</w:t>
             </w:r>
           </w:p>
         </w:tc>
@@ -456,7 +456,7 @@
           <w:left w:w="10" w:type="dxa"/>
           <w:right w:w="10" w:type="dxa"/>
         </w:tblCellMar>
-        <w:tblLook w:val="04A0" w:firstRow="1" w:lastRow="0" w:firstColumn="1" w:lastColumn="0" w:noHBand="0" w:noVBand="1"/>
+        <w:tblLook w:val="0000" w:firstRow="0" w:lastRow="0" w:firstColumn="0" w:lastColumn="0" w:noHBand="0" w:noVBand="0"/>
       </w:tblPr>
       <w:tblGrid>
         <w:gridCol w:w="1519"/>
@@ -529,7 +529,7 @@
                 <w:left w:w="10" w:type="dxa"/>
                 <w:right w:w="10" w:type="dxa"/>
               </w:tblCellMar>
-              <w:tblLook w:val="04A0" w:firstRow="1" w:lastRow="0" w:firstColumn="1" w:lastColumn="0" w:noHBand="0" w:noVBand="1"/>
+              <w:tblLook w:val="0000" w:firstRow="0" w:lastRow="0" w:firstColumn="0" w:lastColumn="0" w:noHBand="0" w:noVBand="0"/>
             </w:tblPr>
             <w:tblGrid>
               <w:gridCol w:w="3066"/>
@@ -910,7 +910,7 @@
           <w:left w:w="10" w:type="dxa"/>
           <w:right w:w="10" w:type="dxa"/>
         </w:tblCellMar>
-        <w:tblLook w:val="04A0" w:firstRow="1" w:lastRow="0" w:firstColumn="1" w:lastColumn="0" w:noHBand="0" w:noVBand="1"/>
+        <w:tblLook w:val="0000" w:firstRow="0" w:lastRow="0" w:firstColumn="0" w:lastColumn="0" w:noHBand="0" w:noVBand="0"/>
       </w:tblPr>
       <w:tblGrid>
         <w:gridCol w:w="1000"/>
@@ -1399,7 +1399,7 @@
           <w:left w:w="10" w:type="dxa"/>
           <w:right w:w="10" w:type="dxa"/>
         </w:tblCellMar>
-        <w:tblLook w:val="04A0" w:firstRow="1" w:lastRow="0" w:firstColumn="1" w:lastColumn="0" w:noHBand="0" w:noVBand="1"/>
+        <w:tblLook w:val="0000" w:firstRow="0" w:lastRow="0" w:firstColumn="0" w:lastColumn="0" w:noHBand="0" w:noVBand="0"/>
       </w:tblPr>
       <w:tblGrid>
         <w:gridCol w:w="1200"/>
@@ -1444,6 +1444,7 @@
                 <w:sz w:val="20"/>
                 <w:szCs w:val="20"/>
               </w:rPr>
+              <w:lastRenderedPageBreak/>
               <w:t>Kode CPMK</w:t>
             </w:r>
           </w:p>
@@ -1557,7 +1558,6 @@
                 <w:sz w:val="20"/>
                 <w:szCs w:val="20"/>
               </w:rPr>
-              <w:lastRenderedPageBreak/>
               <w:t>CPMK-1</w:t>
             </w:r>
           </w:p>
@@ -2117,7 +2117,7 @@
           <w:left w:w="10" w:type="dxa"/>
           <w:right w:w="10" w:type="dxa"/>
         </w:tblCellMar>
-        <w:tblLook w:val="04A0" w:firstRow="1" w:lastRow="0" w:firstColumn="1" w:lastColumn="0" w:noHBand="0" w:noVBand="1"/>
+        <w:tblLook w:val="0000" w:firstRow="0" w:lastRow="0" w:firstColumn="0" w:lastColumn="0" w:noHBand="0" w:noVBand="0"/>
       </w:tblPr>
       <w:tblGrid>
         <w:gridCol w:w="1779"/>
@@ -4290,6 +4290,7 @@
                 <w:sz w:val="20"/>
                 <w:szCs w:val="20"/>
               </w:rPr>
+              <w:lastRenderedPageBreak/>
               <w:t>Sub-CPMK 11</w:t>
             </w:r>
           </w:p>
@@ -4876,7 +4877,6 @@
           <w:sz w:val="28"/>
           <w:szCs w:val="28"/>
         </w:rPr>
-        <w:lastRenderedPageBreak/>
         <w:t>D. DESKRIPSI MATA KULIAH</w:t>
       </w:r>
     </w:p>
@@ -4948,7 +4948,7 @@
           <w:left w:w="10" w:type="dxa"/>
           <w:right w:w="10" w:type="dxa"/>
         </w:tblCellMar>
-        <w:tblLook w:val="04A0" w:firstRow="1" w:lastRow="0" w:firstColumn="1" w:lastColumn="0" w:noHBand="0" w:noVBand="1"/>
+        <w:tblLook w:val="0000" w:firstRow="0" w:lastRow="0" w:firstColumn="0" w:lastColumn="0" w:noHBand="0" w:noVBand="0"/>
       </w:tblPr>
       <w:tblGrid>
         <w:gridCol w:w="535"/>
@@ -5675,7 +5675,7 @@
           <w:left w:w="10" w:type="dxa"/>
           <w:right w:w="10" w:type="dxa"/>
         </w:tblCellMar>
-        <w:tblLook w:val="04A0" w:firstRow="1" w:lastRow="0" w:firstColumn="1" w:lastColumn="0" w:noHBand="0" w:noVBand="1"/>
+        <w:tblLook w:val="0000" w:firstRow="0" w:lastRow="0" w:firstColumn="0" w:lastColumn="0" w:noHBand="0" w:noVBand="0"/>
       </w:tblPr>
       <w:tblGrid>
         <w:gridCol w:w="457"/>
@@ -5726,6 +5726,7 @@
                 <w:sz w:val="20"/>
                 <w:szCs w:val="20"/>
               </w:rPr>
+              <w:lastRenderedPageBreak/>
               <w:t>Mg</w:t>
             </w:r>
           </w:p>
@@ -6119,345 +6120,301 @@
                 <w:sz w:val="18"/>
                 <w:szCs w:val="18"/>
               </w:rPr>
-              <w:t xml:space="preserve">Mahasiswa mampu menjelaskan urgensi investasi </w:t>
-            </w:r>
+              <w:t>Mahasiswa mampu menjelaskan urgensi investasi halal, sejarah PMS Indonesia, dan ekosistem kelembagaan. [Sub-CPMK 1, CPMK-1]</w:t>
+            </w:r>
+          </w:p>
+        </w:tc>
+        <w:tc>
+          <w:tcPr>
+            <w:tcW w:w="1300" w:type="dxa"/>
+            <w:tcBorders>
+              <w:top w:val="single" w:sz="6" w:space="0" w:color="CCCCCC"/>
+              <w:left w:val="single" w:sz="6" w:space="0" w:color="CCCCCC"/>
+              <w:bottom w:val="single" w:sz="6" w:space="0" w:color="CCCCCC"/>
+              <w:right w:val="single" w:sz="6" w:space="0" w:color="CCCCCC"/>
+            </w:tcBorders>
+            <w:shd w:val="clear" w:color="auto" w:fill="F9F9F9"/>
+            <w:tcMar>
+              <w:top w:w="80" w:type="dxa"/>
+              <w:left w:w="120" w:type="dxa"/>
+              <w:bottom w:w="80" w:type="dxa"/>
+              <w:right w:w="120" w:type="dxa"/>
+            </w:tcMar>
+          </w:tcPr>
+          <w:p>
+            <w:pPr>
+              <w:spacing w:before="40" w:after="40"/>
+              <w:jc w:val="both"/>
+            </w:pPr>
+            <w:r>
+              <w:rPr>
+                <w:color w:val="000000"/>
+                <w:sz w:val="17"/>
+                <w:szCs w:val="17"/>
+              </w:rPr>
+              <w:t>Ketepatan menjelaskan sejarah &amp; milestone PMS</w:t>
+            </w:r>
+          </w:p>
+          <w:p>
+            <w:pPr>
+              <w:spacing w:before="60" w:after="40"/>
+              <w:jc w:val="both"/>
+            </w:pPr>
+            <w:r>
+              <w:rPr>
+                <w:color w:val="000000"/>
+                <w:sz w:val="17"/>
+                <w:szCs w:val="17"/>
+              </w:rPr>
+              <w:t>Kemampuan mengidentifikasi aktor ekosistem</w:t>
+            </w:r>
+          </w:p>
+          <w:p>
+            <w:pPr>
+              <w:spacing w:before="60" w:after="40"/>
+              <w:jc w:val="both"/>
+            </w:pPr>
+            <w:r>
+              <w:rPr>
+                <w:color w:val="000000"/>
+                <w:sz w:val="17"/>
+                <w:szCs w:val="17"/>
+              </w:rPr>
+              <w:t>Pemahaman urgensi hifzh al-mal</w:t>
+            </w:r>
+          </w:p>
+        </w:tc>
+        <w:tc>
+          <w:tcPr>
+            <w:tcW w:w="1500" w:type="dxa"/>
+            <w:tcBorders>
+              <w:top w:val="single" w:sz="6" w:space="0" w:color="CCCCCC"/>
+              <w:left w:val="single" w:sz="6" w:space="0" w:color="CCCCCC"/>
+              <w:bottom w:val="single" w:sz="6" w:space="0" w:color="CCCCCC"/>
+              <w:right w:val="single" w:sz="6" w:space="0" w:color="CCCCCC"/>
+            </w:tcBorders>
+            <w:shd w:val="clear" w:color="auto" w:fill="F9F9F9"/>
+            <w:tcMar>
+              <w:top w:w="80" w:type="dxa"/>
+              <w:left w:w="120" w:type="dxa"/>
+              <w:bottom w:w="80" w:type="dxa"/>
+              <w:right w:w="120" w:type="dxa"/>
+            </w:tcMar>
+          </w:tcPr>
+          <w:p>
+            <w:pPr>
+              <w:spacing w:before="40" w:after="40"/>
+              <w:jc w:val="both"/>
+            </w:pPr>
+            <w:r>
+              <w:rPr>
+                <w:color w:val="000000"/>
+                <w:sz w:val="17"/>
+                <w:szCs w:val="17"/>
+              </w:rPr>
+              <w:t>Kriteria: Ketepatan sejarah (40%); Identifikasi ekosistem (35%); Argumen maqashid (25%)</w:t>
+            </w:r>
+          </w:p>
+          <w:p>
+            <w:pPr>
+              <w:spacing w:before="60" w:after="40"/>
+              <w:jc w:val="both"/>
+            </w:pPr>
+            <w:r>
+              <w:rPr>
+                <w:color w:val="000000"/>
+                <w:sz w:val="17"/>
+                <w:szCs w:val="17"/>
+              </w:rPr>
+              <w:t>Teknik: Partisipasi + Mind Map</w:t>
+            </w:r>
+          </w:p>
+        </w:tc>
+        <w:tc>
+          <w:tcPr>
+            <w:tcW w:w="1050" w:type="dxa"/>
+            <w:tcBorders>
+              <w:top w:val="single" w:sz="6" w:space="0" w:color="CCCCCC"/>
+              <w:left w:val="single" w:sz="6" w:space="0" w:color="CCCCCC"/>
+              <w:bottom w:val="single" w:sz="6" w:space="0" w:color="CCCCCC"/>
+              <w:right w:val="single" w:sz="6" w:space="0" w:color="CCCCCC"/>
+            </w:tcBorders>
+            <w:shd w:val="clear" w:color="auto" w:fill="F9F9F9"/>
+            <w:tcMar>
+              <w:top w:w="80" w:type="dxa"/>
+              <w:left w:w="120" w:type="dxa"/>
+              <w:bottom w:w="80" w:type="dxa"/>
+              <w:right w:w="120" w:type="dxa"/>
+            </w:tcMar>
+          </w:tcPr>
+          <w:p>
+            <w:pPr>
+              <w:spacing w:before="40" w:after="40"/>
+              <w:jc w:val="both"/>
+            </w:pPr>
+            <w:r>
+              <w:rPr>
+                <w:color w:val="000000"/>
+                <w:sz w:val="17"/>
+                <w:szCs w:val="17"/>
+              </w:rPr>
+              <w:t>Ceramah interaktif</w:t>
+            </w:r>
+          </w:p>
+          <w:p>
+            <w:pPr>
+              <w:spacing w:before="60" w:after="40"/>
+              <w:jc w:val="both"/>
+            </w:pPr>
+            <w:r>
+              <w:rPr>
+                <w:color w:val="000000"/>
+                <w:sz w:val="17"/>
+                <w:szCs w:val="17"/>
+              </w:rPr>
+              <w:t>Brainstorming: apa bedanya investasi Islam?</w:t>
+            </w:r>
+          </w:p>
+          <w:p>
+            <w:pPr>
+              <w:spacing w:before="60" w:after="40"/>
+              <w:jc w:val="both"/>
+            </w:pPr>
+            <w:r>
+              <w:rPr>
+                <w:color w:val="000000"/>
+                <w:sz w:val="17"/>
+                <w:szCs w:val="17"/>
+              </w:rPr>
+              <w:t>[PB: 2×50]</w:t>
+            </w:r>
+          </w:p>
+        </w:tc>
+        <w:tc>
+          <w:tcPr>
+            <w:tcW w:w="900" w:type="dxa"/>
+            <w:tcBorders>
+              <w:top w:val="single" w:sz="6" w:space="0" w:color="CCCCCC"/>
+              <w:left w:val="single" w:sz="6" w:space="0" w:color="CCCCCC"/>
+              <w:bottom w:val="single" w:sz="6" w:space="0" w:color="CCCCCC"/>
+              <w:right w:val="single" w:sz="6" w:space="0" w:color="CCCCCC"/>
+            </w:tcBorders>
+            <w:shd w:val="clear" w:color="auto" w:fill="F9F9F9"/>
+            <w:tcMar>
+              <w:top w:w="80" w:type="dxa"/>
+              <w:left w:w="120" w:type="dxa"/>
+              <w:bottom w:w="80" w:type="dxa"/>
+              <w:right w:w="120" w:type="dxa"/>
+            </w:tcMar>
+          </w:tcPr>
+          <w:p>
+            <w:pPr>
+              <w:spacing w:before="40" w:after="40"/>
+              <w:jc w:val="both"/>
+            </w:pPr>
+            <w:r>
+              <w:rPr>
+                <w:color w:val="000000"/>
+                <w:sz w:val="17"/>
+                <w:szCs w:val="17"/>
+              </w:rPr>
+              <w:t>Akses IDX Syariah: idx.co.id/idx-syariah</w:t>
+            </w:r>
+          </w:p>
+        </w:tc>
+        <w:tc>
+          <w:tcPr>
+            <w:tcW w:w="1250" w:type="dxa"/>
+            <w:tcBorders>
+              <w:top w:val="single" w:sz="6" w:space="0" w:color="CCCCCC"/>
+              <w:left w:val="single" w:sz="6" w:space="0" w:color="CCCCCC"/>
+              <w:bottom w:val="single" w:sz="6" w:space="0" w:color="CCCCCC"/>
+              <w:right w:val="single" w:sz="6" w:space="0" w:color="CCCCCC"/>
+            </w:tcBorders>
+            <w:shd w:val="clear" w:color="auto" w:fill="F9F9F9"/>
+            <w:tcMar>
+              <w:top w:w="80" w:type="dxa"/>
+              <w:left w:w="120" w:type="dxa"/>
+              <w:bottom w:w="80" w:type="dxa"/>
+              <w:right w:w="120" w:type="dxa"/>
+            </w:tcMar>
+          </w:tcPr>
+          <w:p>
+            <w:pPr>
+              <w:spacing w:before="40" w:after="40"/>
+              <w:jc w:val="both"/>
+            </w:pPr>
+            <w:r>
+              <w:rPr>
+                <w:color w:val="000000"/>
+                <w:sz w:val="17"/>
+                <w:szCs w:val="17"/>
+              </w:rPr>
+              <w:t>Mind map ekosistem PMS Indonesia (BEI, OJK, DSN-MUI, KSEI) — 1 halaman</w:t>
+            </w:r>
+          </w:p>
+        </w:tc>
+        <w:tc>
+          <w:tcPr>
+            <w:tcW w:w="1000" w:type="dxa"/>
+            <w:tcBorders>
+              <w:top w:val="single" w:sz="6" w:space="0" w:color="CCCCCC"/>
+              <w:left w:val="single" w:sz="6" w:space="0" w:color="CCCCCC"/>
+              <w:bottom w:val="single" w:sz="6" w:space="0" w:color="CCCCCC"/>
+              <w:right w:val="single" w:sz="6" w:space="0" w:color="CCCCCC"/>
+            </w:tcBorders>
+            <w:shd w:val="clear" w:color="auto" w:fill="F9F9F9"/>
+            <w:tcMar>
+              <w:top w:w="80" w:type="dxa"/>
+              <w:left w:w="120" w:type="dxa"/>
+              <w:bottom w:w="80" w:type="dxa"/>
+              <w:right w:w="120" w:type="dxa"/>
+            </w:tcMar>
+          </w:tcPr>
+          <w:p>
+            <w:pPr>
+              <w:spacing w:before="40" w:after="40"/>
+              <w:jc w:val="both"/>
+            </w:pPr>
+            <w:r>
+              <w:rPr>
+                <w:color w:val="000000"/>
+                <w:sz w:val="17"/>
+                <w:szCs w:val="17"/>
+              </w:rPr>
+              <w:t>Urgensi investasi halal; Sejarah: JII 2000, ISSI 2011; Ekosistem; Data: kapitalisasi saham syariah BEI 2026</w:t>
+            </w:r>
+          </w:p>
+        </w:tc>
+        <w:tc>
+          <w:tcPr>
+            <w:tcW w:w="400" w:type="dxa"/>
+            <w:tcBorders>
+              <w:top w:val="single" w:sz="6" w:space="0" w:color="CCCCCC"/>
+              <w:left w:val="single" w:sz="6" w:space="0" w:color="CCCCCC"/>
+              <w:bottom w:val="single" w:sz="6" w:space="0" w:color="CCCCCC"/>
+              <w:right w:val="single" w:sz="6" w:space="0" w:color="CCCCCC"/>
+            </w:tcBorders>
+            <w:shd w:val="clear" w:color="auto" w:fill="F9F9F9"/>
+            <w:tcMar>
+              <w:top w:w="80" w:type="dxa"/>
+              <w:left w:w="120" w:type="dxa"/>
+              <w:bottom w:w="80" w:type="dxa"/>
+              <w:right w:w="120" w:type="dxa"/>
+            </w:tcMar>
+            <w:vAlign w:val="center"/>
+          </w:tcPr>
+          <w:p>
+            <w:pPr>
+              <w:spacing w:before="40" w:after="40"/>
+              <w:jc w:val="center"/>
+            </w:pPr>
             <w:r>
               <w:rPr>
                 <w:color w:val="000000"/>
                 <w:sz w:val="18"/>
                 <w:szCs w:val="18"/>
               </w:rPr>
-              <w:lastRenderedPageBreak/>
-              <w:t>halal, sejarah PMS Indonesia, dan ekosistem kelembagaan. [Sub-CPMK 1, CPMK-1]</w:t>
-            </w:r>
-          </w:p>
-        </w:tc>
-        <w:tc>
-          <w:tcPr>
-            <w:tcW w:w="1300" w:type="dxa"/>
-            <w:tcBorders>
-              <w:top w:val="single" w:sz="6" w:space="0" w:color="CCCCCC"/>
-              <w:left w:val="single" w:sz="6" w:space="0" w:color="CCCCCC"/>
-              <w:bottom w:val="single" w:sz="6" w:space="0" w:color="CCCCCC"/>
-              <w:right w:val="single" w:sz="6" w:space="0" w:color="CCCCCC"/>
-            </w:tcBorders>
-            <w:shd w:val="clear" w:color="auto" w:fill="F9F9F9"/>
-            <w:tcMar>
-              <w:top w:w="80" w:type="dxa"/>
-              <w:left w:w="120" w:type="dxa"/>
-              <w:bottom w:w="80" w:type="dxa"/>
-              <w:right w:w="120" w:type="dxa"/>
-            </w:tcMar>
-          </w:tcPr>
-          <w:p>
-            <w:pPr>
-              <w:spacing w:before="40" w:after="40"/>
-              <w:jc w:val="both"/>
-            </w:pPr>
-            <w:r>
-              <w:rPr>
-                <w:color w:val="000000"/>
-                <w:sz w:val="17"/>
-                <w:szCs w:val="17"/>
-              </w:rPr>
-              <w:lastRenderedPageBreak/>
-              <w:t>Ketepatan menjelaskan sejarah &amp; milestone PMS</w:t>
-            </w:r>
-          </w:p>
-          <w:p>
-            <w:pPr>
-              <w:spacing w:before="60" w:after="40"/>
-              <w:jc w:val="both"/>
-            </w:pPr>
-            <w:r>
-              <w:rPr>
-                <w:color w:val="000000"/>
-                <w:sz w:val="17"/>
-                <w:szCs w:val="17"/>
-              </w:rPr>
-              <w:lastRenderedPageBreak/>
-              <w:t>Kemampuan mengidentifikasi aktor ekosistem</w:t>
-            </w:r>
-          </w:p>
-          <w:p>
-            <w:pPr>
-              <w:spacing w:before="60" w:after="40"/>
-              <w:jc w:val="both"/>
-            </w:pPr>
-            <w:r>
-              <w:rPr>
-                <w:color w:val="000000"/>
-                <w:sz w:val="17"/>
-                <w:szCs w:val="17"/>
-              </w:rPr>
-              <w:t>Pemahaman urgensi hifzh al-mal</w:t>
-            </w:r>
-          </w:p>
-        </w:tc>
-        <w:tc>
-          <w:tcPr>
-            <w:tcW w:w="1500" w:type="dxa"/>
-            <w:tcBorders>
-              <w:top w:val="single" w:sz="6" w:space="0" w:color="CCCCCC"/>
-              <w:left w:val="single" w:sz="6" w:space="0" w:color="CCCCCC"/>
-              <w:bottom w:val="single" w:sz="6" w:space="0" w:color="CCCCCC"/>
-              <w:right w:val="single" w:sz="6" w:space="0" w:color="CCCCCC"/>
-            </w:tcBorders>
-            <w:shd w:val="clear" w:color="auto" w:fill="F9F9F9"/>
-            <w:tcMar>
-              <w:top w:w="80" w:type="dxa"/>
-              <w:left w:w="120" w:type="dxa"/>
-              <w:bottom w:w="80" w:type="dxa"/>
-              <w:right w:w="120" w:type="dxa"/>
-            </w:tcMar>
-          </w:tcPr>
-          <w:p>
-            <w:pPr>
-              <w:spacing w:before="40" w:after="40"/>
-              <w:jc w:val="both"/>
-            </w:pPr>
-            <w:r>
-              <w:rPr>
-                <w:color w:val="000000"/>
-                <w:sz w:val="17"/>
-                <w:szCs w:val="17"/>
-              </w:rPr>
-              <w:lastRenderedPageBreak/>
-              <w:t xml:space="preserve">Kriteria: Ketepatan sejarah (40%); Identifikasi </w:t>
-            </w:r>
-            <w:r>
-              <w:rPr>
-                <w:color w:val="000000"/>
-                <w:sz w:val="17"/>
-                <w:szCs w:val="17"/>
-              </w:rPr>
-              <w:lastRenderedPageBreak/>
-              <w:t>ekosistem (35%); Argumen maqashid (25%)</w:t>
-            </w:r>
-          </w:p>
-          <w:p>
-            <w:pPr>
-              <w:spacing w:before="60" w:after="40"/>
-              <w:jc w:val="both"/>
-            </w:pPr>
-            <w:r>
-              <w:rPr>
-                <w:color w:val="000000"/>
-                <w:sz w:val="17"/>
-                <w:szCs w:val="17"/>
-              </w:rPr>
-              <w:t>Teknik: Partisipasi + Mind Map</w:t>
-            </w:r>
-          </w:p>
-        </w:tc>
-        <w:tc>
-          <w:tcPr>
-            <w:tcW w:w="1050" w:type="dxa"/>
-            <w:tcBorders>
-              <w:top w:val="single" w:sz="6" w:space="0" w:color="CCCCCC"/>
-              <w:left w:val="single" w:sz="6" w:space="0" w:color="CCCCCC"/>
-              <w:bottom w:val="single" w:sz="6" w:space="0" w:color="CCCCCC"/>
-              <w:right w:val="single" w:sz="6" w:space="0" w:color="CCCCCC"/>
-            </w:tcBorders>
-            <w:shd w:val="clear" w:color="auto" w:fill="F9F9F9"/>
-            <w:tcMar>
-              <w:top w:w="80" w:type="dxa"/>
-              <w:left w:w="120" w:type="dxa"/>
-              <w:bottom w:w="80" w:type="dxa"/>
-              <w:right w:w="120" w:type="dxa"/>
-            </w:tcMar>
-          </w:tcPr>
-          <w:p>
-            <w:pPr>
-              <w:spacing w:before="40" w:after="40"/>
-              <w:jc w:val="both"/>
-            </w:pPr>
-            <w:r>
-              <w:rPr>
-                <w:color w:val="000000"/>
-                <w:sz w:val="17"/>
-                <w:szCs w:val="17"/>
-              </w:rPr>
-              <w:lastRenderedPageBreak/>
-              <w:t>Ceramah interaktif</w:t>
-            </w:r>
-          </w:p>
-          <w:p>
-            <w:pPr>
-              <w:spacing w:before="60" w:after="40"/>
-              <w:jc w:val="both"/>
-            </w:pPr>
-            <w:r>
-              <w:rPr>
-                <w:color w:val="000000"/>
-                <w:sz w:val="17"/>
-                <w:szCs w:val="17"/>
-              </w:rPr>
-              <w:t>Brainstorming: apa bedanya investasi Islam?</w:t>
-            </w:r>
-          </w:p>
-          <w:p>
-            <w:pPr>
-              <w:spacing w:before="60" w:after="40"/>
-              <w:jc w:val="both"/>
-            </w:pPr>
-            <w:r>
-              <w:rPr>
-                <w:color w:val="000000"/>
-                <w:sz w:val="17"/>
-                <w:szCs w:val="17"/>
-              </w:rPr>
-              <w:lastRenderedPageBreak/>
-              <w:t>[PB: 2×50]</w:t>
-            </w:r>
-          </w:p>
-        </w:tc>
-        <w:tc>
-          <w:tcPr>
-            <w:tcW w:w="900" w:type="dxa"/>
-            <w:tcBorders>
-              <w:top w:val="single" w:sz="6" w:space="0" w:color="CCCCCC"/>
-              <w:left w:val="single" w:sz="6" w:space="0" w:color="CCCCCC"/>
-              <w:bottom w:val="single" w:sz="6" w:space="0" w:color="CCCCCC"/>
-              <w:right w:val="single" w:sz="6" w:space="0" w:color="CCCCCC"/>
-            </w:tcBorders>
-            <w:shd w:val="clear" w:color="auto" w:fill="F9F9F9"/>
-            <w:tcMar>
-              <w:top w:w="80" w:type="dxa"/>
-              <w:left w:w="120" w:type="dxa"/>
-              <w:bottom w:w="80" w:type="dxa"/>
-              <w:right w:w="120" w:type="dxa"/>
-            </w:tcMar>
-          </w:tcPr>
-          <w:p>
-            <w:pPr>
-              <w:spacing w:before="40" w:after="40"/>
-              <w:jc w:val="both"/>
-            </w:pPr>
-            <w:r>
-              <w:rPr>
-                <w:color w:val="000000"/>
-                <w:sz w:val="17"/>
-                <w:szCs w:val="17"/>
-              </w:rPr>
-              <w:lastRenderedPageBreak/>
-              <w:t>Akses IDX Syariah: idx.co.id/idx-syariah</w:t>
-            </w:r>
-          </w:p>
-        </w:tc>
-        <w:tc>
-          <w:tcPr>
-            <w:tcW w:w="1250" w:type="dxa"/>
-            <w:tcBorders>
-              <w:top w:val="single" w:sz="6" w:space="0" w:color="CCCCCC"/>
-              <w:left w:val="single" w:sz="6" w:space="0" w:color="CCCCCC"/>
-              <w:bottom w:val="single" w:sz="6" w:space="0" w:color="CCCCCC"/>
-              <w:right w:val="single" w:sz="6" w:space="0" w:color="CCCCCC"/>
-            </w:tcBorders>
-            <w:shd w:val="clear" w:color="auto" w:fill="F9F9F9"/>
-            <w:tcMar>
-              <w:top w:w="80" w:type="dxa"/>
-              <w:left w:w="120" w:type="dxa"/>
-              <w:bottom w:w="80" w:type="dxa"/>
-              <w:right w:w="120" w:type="dxa"/>
-            </w:tcMar>
-          </w:tcPr>
-          <w:p>
-            <w:pPr>
-              <w:spacing w:before="40" w:after="40"/>
-              <w:jc w:val="both"/>
-            </w:pPr>
-            <w:r>
-              <w:rPr>
-                <w:color w:val="000000"/>
-                <w:sz w:val="17"/>
-                <w:szCs w:val="17"/>
-              </w:rPr>
-              <w:t xml:space="preserve">Mind map ekosistem PMS Indonesia (BEI, OJK, DSN-MUI, </w:t>
-            </w:r>
-            <w:r>
-              <w:rPr>
-                <w:color w:val="000000"/>
-                <w:sz w:val="17"/>
-                <w:szCs w:val="17"/>
-              </w:rPr>
-              <w:lastRenderedPageBreak/>
-              <w:t>KSEI) — 1 halaman</w:t>
-            </w:r>
-          </w:p>
-        </w:tc>
-        <w:tc>
-          <w:tcPr>
-            <w:tcW w:w="1000" w:type="dxa"/>
-            <w:tcBorders>
-              <w:top w:val="single" w:sz="6" w:space="0" w:color="CCCCCC"/>
-              <w:left w:val="single" w:sz="6" w:space="0" w:color="CCCCCC"/>
-              <w:bottom w:val="single" w:sz="6" w:space="0" w:color="CCCCCC"/>
-              <w:right w:val="single" w:sz="6" w:space="0" w:color="CCCCCC"/>
-            </w:tcBorders>
-            <w:shd w:val="clear" w:color="auto" w:fill="F9F9F9"/>
-            <w:tcMar>
-              <w:top w:w="80" w:type="dxa"/>
-              <w:left w:w="120" w:type="dxa"/>
-              <w:bottom w:w="80" w:type="dxa"/>
-              <w:right w:w="120" w:type="dxa"/>
-            </w:tcMar>
-          </w:tcPr>
-          <w:p>
-            <w:pPr>
-              <w:spacing w:before="40" w:after="40"/>
-              <w:jc w:val="both"/>
-            </w:pPr>
-            <w:r>
-              <w:rPr>
-                <w:color w:val="000000"/>
-                <w:sz w:val="17"/>
-                <w:szCs w:val="17"/>
-              </w:rPr>
-              <w:lastRenderedPageBreak/>
-              <w:t xml:space="preserve">Urgensi investasi halal; Sejarah: JII 2000, ISSI 2011; Ekosistem; </w:t>
-            </w:r>
-            <w:r>
-              <w:rPr>
-                <w:color w:val="000000"/>
-                <w:sz w:val="17"/>
-                <w:szCs w:val="17"/>
-              </w:rPr>
-              <w:lastRenderedPageBreak/>
-              <w:t>Data: kapitalisasi saham syariah BEI 2026</w:t>
-            </w:r>
-          </w:p>
-        </w:tc>
-        <w:tc>
-          <w:tcPr>
-            <w:tcW w:w="400" w:type="dxa"/>
-            <w:tcBorders>
-              <w:top w:val="single" w:sz="6" w:space="0" w:color="CCCCCC"/>
-              <w:left w:val="single" w:sz="6" w:space="0" w:color="CCCCCC"/>
-              <w:bottom w:val="single" w:sz="6" w:space="0" w:color="CCCCCC"/>
-              <w:right w:val="single" w:sz="6" w:space="0" w:color="CCCCCC"/>
-            </w:tcBorders>
-            <w:shd w:val="clear" w:color="auto" w:fill="F9F9F9"/>
-            <w:tcMar>
-              <w:top w:w="80" w:type="dxa"/>
-              <w:left w:w="120" w:type="dxa"/>
-              <w:bottom w:w="80" w:type="dxa"/>
-              <w:right w:w="120" w:type="dxa"/>
-            </w:tcMar>
-            <w:vAlign w:val="center"/>
-          </w:tcPr>
-          <w:p>
-            <w:pPr>
-              <w:spacing w:before="40" w:after="40"/>
-              <w:jc w:val="center"/>
-            </w:pPr>
-            <w:r>
-              <w:rPr>
-                <w:color w:val="000000"/>
-                <w:sz w:val="18"/>
-                <w:szCs w:val="18"/>
-              </w:rPr>
-              <w:lastRenderedPageBreak/>
               <w:t>5%</w:t>
             </w:r>
           </w:p>
@@ -7275,6 +7232,7 @@
                 <w:sz w:val="20"/>
                 <w:szCs w:val="20"/>
               </w:rPr>
+              <w:lastRenderedPageBreak/>
               <w:t>4</w:t>
             </w:r>
           </w:p>
@@ -7683,7 +7641,6 @@
                 <w:sz w:val="20"/>
                 <w:szCs w:val="20"/>
               </w:rPr>
-              <w:lastRenderedPageBreak/>
               <w:t>5</w:t>
             </w:r>
           </w:p>
@@ -8420,6 +8377,7 @@
                 <w:sz w:val="20"/>
                 <w:szCs w:val="20"/>
               </w:rPr>
+              <w:lastRenderedPageBreak/>
               <w:t>7</w:t>
             </w:r>
           </w:p>
@@ -8822,16 +8780,7 @@
                 <w:sz w:val="18"/>
                 <w:szCs w:val="18"/>
               </w:rPr>
-              <w:t>UTS — Materi Mg.1-7: regulasi, screening DES, analisis fundamental</w:t>
-            </w:r>
-            <w:r>
-              <w:rPr>
-                <w:color w:val="000000"/>
-                <w:sz w:val="18"/>
-                <w:szCs w:val="18"/>
-              </w:rPr>
-              <w:lastRenderedPageBreak/>
-              <w:t>, instrumen PMS. [CPMK 1-3]</w:t>
+              <w:t>UTS — Materi Mg.1-7: regulasi, screening DES, analisis fundamental, instrumen PMS. [CPMK 1-3]</w:t>
             </w:r>
           </w:p>
         </w:tc>
@@ -8863,7 +8812,6 @@
                 <w:sz w:val="17"/>
                 <w:szCs w:val="17"/>
               </w:rPr>
-              <w:lastRenderedPageBreak/>
               <w:t>Ketepatan uraian regulasi &amp; fiqih PMS</w:t>
             </w:r>
           </w:p>
@@ -8878,16 +8826,7 @@
                 <w:sz w:val="17"/>
                 <w:szCs w:val="17"/>
               </w:rPr>
-              <w:t xml:space="preserve">Kemampuan hitungan screening </w:t>
-            </w:r>
-            <w:r>
-              <w:rPr>
-                <w:color w:val="000000"/>
-                <w:sz w:val="17"/>
-                <w:szCs w:val="17"/>
-              </w:rPr>
-              <w:lastRenderedPageBreak/>
-              <w:t>DES + rasio fundamental</w:t>
+              <w:t>Kemampuan hitungan screening DES + rasio fundamental</w:t>
             </w:r>
           </w:p>
           <w:p>
@@ -8933,17 +8872,7 @@
                 <w:sz w:val="17"/>
                 <w:szCs w:val="17"/>
               </w:rPr>
-              <w:lastRenderedPageBreak/>
-              <w:t xml:space="preserve">Kriteria: Hitungan 60% (screening + rasio fundamental + Sharpe); Uraian </w:t>
-            </w:r>
-            <w:r>
-              <w:rPr>
-                <w:color w:val="000000"/>
-                <w:sz w:val="17"/>
-                <w:szCs w:val="17"/>
-              </w:rPr>
-              <w:lastRenderedPageBreak/>
-              <w:t>analitis 40%</w:t>
+              <w:t>Kriteria: Hitungan 60% (screening + rasio fundamental + Sharpe); Uraian analitis 40%</w:t>
             </w:r>
           </w:p>
           <w:p>
@@ -8989,7 +8918,6 @@
                 <w:sz w:val="17"/>
                 <w:szCs w:val="17"/>
               </w:rPr>
-              <w:lastRenderedPageBreak/>
               <w:t>Ujian tulis tertutup</w:t>
             </w:r>
           </w:p>
@@ -9616,301 +9544,351 @@
                 <w:sz w:val="18"/>
                 <w:szCs w:val="18"/>
               </w:rPr>
-              <w:t>Mahasiswa mampu menyusun portofolio investasi syariah terdiversifikasi menggunakan prinsip modern portfolio theory. [Sub-CPMK 9, CPMK-4]</w:t>
-            </w:r>
-          </w:p>
-        </w:tc>
-        <w:tc>
-          <w:tcPr>
-            <w:tcW w:w="1300" w:type="dxa"/>
-            <w:tcBorders>
-              <w:top w:val="single" w:sz="6" w:space="0" w:color="CCCCCC"/>
-              <w:left w:val="single" w:sz="6" w:space="0" w:color="CCCCCC"/>
-              <w:bottom w:val="single" w:sz="6" w:space="0" w:color="CCCCCC"/>
-              <w:right w:val="single" w:sz="6" w:space="0" w:color="CCCCCC"/>
-            </w:tcBorders>
-            <w:shd w:val="clear" w:color="auto" w:fill="F9F9F9"/>
-            <w:tcMar>
-              <w:top w:w="80" w:type="dxa"/>
-              <w:left w:w="120" w:type="dxa"/>
-              <w:bottom w:w="80" w:type="dxa"/>
-              <w:right w:w="120" w:type="dxa"/>
-            </w:tcMar>
-          </w:tcPr>
-          <w:p>
-            <w:pPr>
-              <w:spacing w:before="40" w:after="40"/>
-              <w:jc w:val="both"/>
-            </w:pPr>
-            <w:r>
-              <w:rPr>
-                <w:color w:val="000000"/>
-                <w:sz w:val="17"/>
-                <w:szCs w:val="17"/>
-              </w:rPr>
-              <w:t>Ketepatan prinsip diversifikasi dalam Islam</w:t>
-            </w:r>
-          </w:p>
-          <w:p>
-            <w:pPr>
-              <w:spacing w:before="60" w:after="40"/>
-              <w:jc w:val="both"/>
-            </w:pPr>
-            <w:r>
-              <w:rPr>
-                <w:color w:val="000000"/>
-                <w:sz w:val="17"/>
-                <w:szCs w:val="17"/>
-              </w:rPr>
-              <w:t>Kemampuan alokasi aset: saham, sukuk, reksa dana, emas</w:t>
-            </w:r>
-          </w:p>
-          <w:p>
-            <w:pPr>
-              <w:spacing w:before="60" w:after="40"/>
-              <w:jc w:val="both"/>
-            </w:pPr>
-            <w:r>
-              <w:rPr>
-                <w:color w:val="000000"/>
-                <w:sz w:val="17"/>
-                <w:szCs w:val="17"/>
-              </w:rPr>
-              <w:t>Kualitas justifikasi pemilihan instrumen</w:t>
-            </w:r>
-          </w:p>
-        </w:tc>
-        <w:tc>
-          <w:tcPr>
-            <w:tcW w:w="1500" w:type="dxa"/>
-            <w:tcBorders>
-              <w:top w:val="single" w:sz="6" w:space="0" w:color="CCCCCC"/>
-              <w:left w:val="single" w:sz="6" w:space="0" w:color="CCCCCC"/>
-              <w:bottom w:val="single" w:sz="6" w:space="0" w:color="CCCCCC"/>
-              <w:right w:val="single" w:sz="6" w:space="0" w:color="CCCCCC"/>
-            </w:tcBorders>
-            <w:shd w:val="clear" w:color="auto" w:fill="F9F9F9"/>
-            <w:tcMar>
-              <w:top w:w="80" w:type="dxa"/>
-              <w:left w:w="120" w:type="dxa"/>
-              <w:bottom w:w="80" w:type="dxa"/>
-              <w:right w:w="120" w:type="dxa"/>
-            </w:tcMar>
-          </w:tcPr>
-          <w:p>
-            <w:pPr>
-              <w:spacing w:before="40" w:after="40"/>
-              <w:jc w:val="both"/>
-            </w:pPr>
-            <w:r>
-              <w:rPr>
-                <w:color w:val="000000"/>
-                <w:sz w:val="17"/>
-                <w:szCs w:val="17"/>
-              </w:rPr>
-              <w:t>Kriteria: Ketepatan prinsip diversifikasi (35%); Kualitas alokasi aset (40%); Justifikasi syariah (25%)</w:t>
-            </w:r>
-          </w:p>
-          <w:p>
-            <w:pPr>
-              <w:spacing w:before="60" w:after="40"/>
-              <w:jc w:val="both"/>
-            </w:pPr>
-            <w:r>
-              <w:rPr>
-                <w:color w:val="000000"/>
-                <w:sz w:val="17"/>
-                <w:szCs w:val="17"/>
-              </w:rPr>
-              <w:t>Teknik: Workshop Portofolio</w:t>
-            </w:r>
-          </w:p>
-        </w:tc>
-        <w:tc>
-          <w:tcPr>
-            <w:tcW w:w="1050" w:type="dxa"/>
-            <w:tcBorders>
-              <w:top w:val="single" w:sz="6" w:space="0" w:color="CCCCCC"/>
-              <w:left w:val="single" w:sz="6" w:space="0" w:color="CCCCCC"/>
-              <w:bottom w:val="single" w:sz="6" w:space="0" w:color="CCCCCC"/>
-              <w:right w:val="single" w:sz="6" w:space="0" w:color="CCCCCC"/>
-            </w:tcBorders>
-            <w:shd w:val="clear" w:color="auto" w:fill="F9F9F9"/>
-            <w:tcMar>
-              <w:top w:w="80" w:type="dxa"/>
-              <w:left w:w="120" w:type="dxa"/>
-              <w:bottom w:w="80" w:type="dxa"/>
-              <w:right w:w="120" w:type="dxa"/>
-            </w:tcMar>
-          </w:tcPr>
-          <w:p>
-            <w:pPr>
-              <w:spacing w:before="40" w:after="40"/>
-              <w:jc w:val="both"/>
-            </w:pPr>
-            <w:r>
-              <w:rPr>
-                <w:color w:val="000000"/>
-                <w:sz w:val="17"/>
-                <w:szCs w:val="17"/>
-              </w:rPr>
-              <w:t>Workshop: penyusunan portofolio Rp10 juta hipotetis</w:t>
-            </w:r>
-          </w:p>
-          <w:p>
-            <w:pPr>
-              <w:spacing w:before="60" w:after="40"/>
-              <w:jc w:val="both"/>
-            </w:pPr>
-            <w:r>
-              <w:rPr>
-                <w:color w:val="000000"/>
-                <w:sz w:val="17"/>
-                <w:szCs w:val="17"/>
-              </w:rPr>
-              <w:t>Peer review alokasi</w:t>
-            </w:r>
-          </w:p>
-          <w:p>
-            <w:pPr>
-              <w:spacing w:before="60" w:after="40"/>
-              <w:jc w:val="both"/>
-            </w:pPr>
-            <w:r>
-              <w:rPr>
-                <w:color w:val="000000"/>
-                <w:sz w:val="17"/>
-                <w:szCs w:val="17"/>
-              </w:rPr>
-              <w:t>[PB: 2×50]</w:t>
-            </w:r>
-          </w:p>
-        </w:tc>
-        <w:tc>
-          <w:tcPr>
-            <w:tcW w:w="900" w:type="dxa"/>
-            <w:tcBorders>
-              <w:top w:val="single" w:sz="6" w:space="0" w:color="CCCCCC"/>
-              <w:left w:val="single" w:sz="6" w:space="0" w:color="CCCCCC"/>
-              <w:bottom w:val="single" w:sz="6" w:space="0" w:color="CCCCCC"/>
-              <w:right w:val="single" w:sz="6" w:space="0" w:color="CCCCCC"/>
-            </w:tcBorders>
-            <w:shd w:val="clear" w:color="auto" w:fill="F9F9F9"/>
-            <w:tcMar>
-              <w:top w:w="80" w:type="dxa"/>
-              <w:left w:w="120" w:type="dxa"/>
-              <w:bottom w:w="80" w:type="dxa"/>
-              <w:right w:w="120" w:type="dxa"/>
-            </w:tcMar>
-          </w:tcPr>
-          <w:p>
-            <w:pPr>
-              <w:spacing w:before="40" w:after="40"/>
-              <w:jc w:val="both"/>
-            </w:pPr>
-            <w:r>
-              <w:rPr>
-                <w:color w:val="000000"/>
-                <w:sz w:val="17"/>
-                <w:szCs w:val="17"/>
-              </w:rPr>
-              <w:t>Data: BEI, OJK, Bibit untuk pemilihan instrumen; Cek DES terkini</w:t>
-            </w:r>
-          </w:p>
-        </w:tc>
-        <w:tc>
-          <w:tcPr>
-            <w:tcW w:w="1250" w:type="dxa"/>
-            <w:tcBorders>
-              <w:top w:val="single" w:sz="6" w:space="0" w:color="CCCCCC"/>
-              <w:left w:val="single" w:sz="6" w:space="0" w:color="CCCCCC"/>
-              <w:bottom w:val="single" w:sz="6" w:space="0" w:color="CCCCCC"/>
-              <w:right w:val="single" w:sz="6" w:space="0" w:color="CCCCCC"/>
-            </w:tcBorders>
-            <w:shd w:val="clear" w:color="auto" w:fill="F9F9F9"/>
-            <w:tcMar>
-              <w:top w:w="80" w:type="dxa"/>
-              <w:left w:w="120" w:type="dxa"/>
-              <w:bottom w:w="80" w:type="dxa"/>
-              <w:right w:w="120" w:type="dxa"/>
-            </w:tcMar>
-          </w:tcPr>
-          <w:p>
-            <w:pPr>
-              <w:spacing w:before="40" w:after="40"/>
-              <w:jc w:val="both"/>
-            </w:pPr>
-            <w:r>
-              <w:rPr>
-                <w:color w:val="000000"/>
-                <w:sz w:val="17"/>
-                <w:szCs w:val="17"/>
-              </w:rPr>
-              <w:t>Draft Portofolio Rp10 juta: 4 instrumen (saham, sukuk, reksa dana, emas) + justifikasi syariah setiap instrumen (5%)</w:t>
-            </w:r>
-          </w:p>
-        </w:tc>
-        <w:tc>
-          <w:tcPr>
-            <w:tcW w:w="1000" w:type="dxa"/>
-            <w:tcBorders>
-              <w:top w:val="single" w:sz="6" w:space="0" w:color="CCCCCC"/>
-              <w:left w:val="single" w:sz="6" w:space="0" w:color="CCCCCC"/>
-              <w:bottom w:val="single" w:sz="6" w:space="0" w:color="CCCCCC"/>
-              <w:right w:val="single" w:sz="6" w:space="0" w:color="CCCCCC"/>
-            </w:tcBorders>
-            <w:shd w:val="clear" w:color="auto" w:fill="F9F9F9"/>
-            <w:tcMar>
-              <w:top w:w="80" w:type="dxa"/>
-              <w:left w:w="120" w:type="dxa"/>
-              <w:bottom w:w="80" w:type="dxa"/>
-              <w:right w:w="120" w:type="dxa"/>
-            </w:tcMar>
-          </w:tcPr>
-          <w:p>
-            <w:pPr>
-              <w:spacing w:before="40" w:after="40"/>
-              <w:jc w:val="both"/>
-            </w:pPr>
-            <w:r>
-              <w:rPr>
-                <w:color w:val="000000"/>
-                <w:sz w:val="17"/>
-                <w:szCs w:val="17"/>
-              </w:rPr>
-              <w:t>Diversifikasi Islam: tawarruk; MPT Markowitz; Risk-return; Korelasi aset; Asset allocation; Rebalancing; Emas sebagai safe haven Islami</w:t>
-            </w:r>
-          </w:p>
-        </w:tc>
-        <w:tc>
-          <w:tcPr>
-            <w:tcW w:w="400" w:type="dxa"/>
-            <w:tcBorders>
-              <w:top w:val="single" w:sz="6" w:space="0" w:color="CCCCCC"/>
-              <w:left w:val="single" w:sz="6" w:space="0" w:color="CCCCCC"/>
-              <w:bottom w:val="single" w:sz="6" w:space="0" w:color="CCCCCC"/>
-              <w:right w:val="single" w:sz="6" w:space="0" w:color="CCCCCC"/>
-            </w:tcBorders>
-            <w:shd w:val="clear" w:color="auto" w:fill="F9F9F9"/>
-            <w:tcMar>
-              <w:top w:w="80" w:type="dxa"/>
-              <w:left w:w="120" w:type="dxa"/>
-              <w:bottom w:w="80" w:type="dxa"/>
-              <w:right w:w="120" w:type="dxa"/>
-            </w:tcMar>
-            <w:vAlign w:val="center"/>
-          </w:tcPr>
-          <w:p>
-            <w:pPr>
-              <w:spacing w:before="40" w:after="40"/>
-              <w:jc w:val="center"/>
-            </w:pPr>
+              <w:t xml:space="preserve">Mahasiswa mampu menyusun portofolio investasi syariah terdiversifikasi </w:t>
+            </w:r>
             <w:r>
               <w:rPr>
                 <w:color w:val="000000"/>
                 <w:sz w:val="18"/>
                 <w:szCs w:val="18"/>
               </w:rPr>
+              <w:lastRenderedPageBreak/>
+              <w:t>menggunakan prinsip modern portfolio theory. [Sub-CPMK 9, CPMK-4]</w:t>
+            </w:r>
+          </w:p>
+        </w:tc>
+        <w:tc>
+          <w:tcPr>
+            <w:tcW w:w="1300" w:type="dxa"/>
+            <w:tcBorders>
+              <w:top w:val="single" w:sz="6" w:space="0" w:color="CCCCCC"/>
+              <w:left w:val="single" w:sz="6" w:space="0" w:color="CCCCCC"/>
+              <w:bottom w:val="single" w:sz="6" w:space="0" w:color="CCCCCC"/>
+              <w:right w:val="single" w:sz="6" w:space="0" w:color="CCCCCC"/>
+            </w:tcBorders>
+            <w:shd w:val="clear" w:color="auto" w:fill="F9F9F9"/>
+            <w:tcMar>
+              <w:top w:w="80" w:type="dxa"/>
+              <w:left w:w="120" w:type="dxa"/>
+              <w:bottom w:w="80" w:type="dxa"/>
+              <w:right w:w="120" w:type="dxa"/>
+            </w:tcMar>
+          </w:tcPr>
+          <w:p>
+            <w:pPr>
+              <w:spacing w:before="40" w:after="40"/>
+              <w:jc w:val="both"/>
+            </w:pPr>
+            <w:r>
+              <w:rPr>
+                <w:color w:val="000000"/>
+                <w:sz w:val="17"/>
+                <w:szCs w:val="17"/>
+              </w:rPr>
+              <w:lastRenderedPageBreak/>
+              <w:t>Ketepatan prinsip diversifikasi dalam Islam</w:t>
+            </w:r>
+          </w:p>
+          <w:p>
+            <w:pPr>
+              <w:spacing w:before="60" w:after="40"/>
+              <w:jc w:val="both"/>
+            </w:pPr>
+            <w:r>
+              <w:rPr>
+                <w:color w:val="000000"/>
+                <w:sz w:val="17"/>
+                <w:szCs w:val="17"/>
+              </w:rPr>
+              <w:t xml:space="preserve">Kemampuan alokasi aset: saham, </w:t>
+            </w:r>
+            <w:r>
+              <w:rPr>
+                <w:color w:val="000000"/>
+                <w:sz w:val="17"/>
+                <w:szCs w:val="17"/>
+              </w:rPr>
+              <w:lastRenderedPageBreak/>
+              <w:t>sukuk, reksa dana, emas</w:t>
+            </w:r>
+          </w:p>
+          <w:p>
+            <w:pPr>
+              <w:spacing w:before="60" w:after="40"/>
+              <w:jc w:val="both"/>
+            </w:pPr>
+            <w:r>
+              <w:rPr>
+                <w:color w:val="000000"/>
+                <w:sz w:val="17"/>
+                <w:szCs w:val="17"/>
+              </w:rPr>
+              <w:t>Kualitas justifikasi pemilihan instrumen</w:t>
+            </w:r>
+          </w:p>
+        </w:tc>
+        <w:tc>
+          <w:tcPr>
+            <w:tcW w:w="1500" w:type="dxa"/>
+            <w:tcBorders>
+              <w:top w:val="single" w:sz="6" w:space="0" w:color="CCCCCC"/>
+              <w:left w:val="single" w:sz="6" w:space="0" w:color="CCCCCC"/>
+              <w:bottom w:val="single" w:sz="6" w:space="0" w:color="CCCCCC"/>
+              <w:right w:val="single" w:sz="6" w:space="0" w:color="CCCCCC"/>
+            </w:tcBorders>
+            <w:shd w:val="clear" w:color="auto" w:fill="F9F9F9"/>
+            <w:tcMar>
+              <w:top w:w="80" w:type="dxa"/>
+              <w:left w:w="120" w:type="dxa"/>
+              <w:bottom w:w="80" w:type="dxa"/>
+              <w:right w:w="120" w:type="dxa"/>
+            </w:tcMar>
+          </w:tcPr>
+          <w:p>
+            <w:pPr>
+              <w:spacing w:before="40" w:after="40"/>
+              <w:jc w:val="both"/>
+            </w:pPr>
+            <w:r>
+              <w:rPr>
+                <w:color w:val="000000"/>
+                <w:sz w:val="17"/>
+                <w:szCs w:val="17"/>
+              </w:rPr>
+              <w:lastRenderedPageBreak/>
+              <w:t xml:space="preserve">Kriteria: Ketepatan prinsip diversifikasi (35%); Kualitas alokasi aset </w:t>
+            </w:r>
+            <w:r>
+              <w:rPr>
+                <w:color w:val="000000"/>
+                <w:sz w:val="17"/>
+                <w:szCs w:val="17"/>
+              </w:rPr>
+              <w:lastRenderedPageBreak/>
+              <w:t>(40%); Justifikasi syariah (25%)</w:t>
+            </w:r>
+          </w:p>
+          <w:p>
+            <w:pPr>
+              <w:spacing w:before="60" w:after="40"/>
+              <w:jc w:val="both"/>
+            </w:pPr>
+            <w:r>
+              <w:rPr>
+                <w:color w:val="000000"/>
+                <w:sz w:val="17"/>
+                <w:szCs w:val="17"/>
+              </w:rPr>
+              <w:t>Teknik: Workshop Portofolio</w:t>
+            </w:r>
+          </w:p>
+        </w:tc>
+        <w:tc>
+          <w:tcPr>
+            <w:tcW w:w="1050" w:type="dxa"/>
+            <w:tcBorders>
+              <w:top w:val="single" w:sz="6" w:space="0" w:color="CCCCCC"/>
+              <w:left w:val="single" w:sz="6" w:space="0" w:color="CCCCCC"/>
+              <w:bottom w:val="single" w:sz="6" w:space="0" w:color="CCCCCC"/>
+              <w:right w:val="single" w:sz="6" w:space="0" w:color="CCCCCC"/>
+            </w:tcBorders>
+            <w:shd w:val="clear" w:color="auto" w:fill="F9F9F9"/>
+            <w:tcMar>
+              <w:top w:w="80" w:type="dxa"/>
+              <w:left w:w="120" w:type="dxa"/>
+              <w:bottom w:w="80" w:type="dxa"/>
+              <w:right w:w="120" w:type="dxa"/>
+            </w:tcMar>
+          </w:tcPr>
+          <w:p>
+            <w:pPr>
+              <w:spacing w:before="40" w:after="40"/>
+              <w:jc w:val="both"/>
+            </w:pPr>
+            <w:r>
+              <w:rPr>
+                <w:color w:val="000000"/>
+                <w:sz w:val="17"/>
+                <w:szCs w:val="17"/>
+              </w:rPr>
+              <w:lastRenderedPageBreak/>
+              <w:t>Workshop: penyusunan portofolio Rp10 juta hipotetis</w:t>
+            </w:r>
+          </w:p>
+          <w:p>
+            <w:pPr>
+              <w:spacing w:before="60" w:after="40"/>
+              <w:jc w:val="both"/>
+            </w:pPr>
+            <w:r>
+              <w:rPr>
+                <w:color w:val="000000"/>
+                <w:sz w:val="17"/>
+                <w:szCs w:val="17"/>
+              </w:rPr>
+              <w:t>Peer review alokasi</w:t>
+            </w:r>
+          </w:p>
+          <w:p>
+            <w:pPr>
+              <w:spacing w:before="60" w:after="40"/>
+              <w:jc w:val="both"/>
+            </w:pPr>
+            <w:r>
+              <w:rPr>
+                <w:color w:val="000000"/>
+                <w:sz w:val="17"/>
+                <w:szCs w:val="17"/>
+              </w:rPr>
+              <w:t>[PB: 2×50]</w:t>
+            </w:r>
+          </w:p>
+        </w:tc>
+        <w:tc>
+          <w:tcPr>
+            <w:tcW w:w="900" w:type="dxa"/>
+            <w:tcBorders>
+              <w:top w:val="single" w:sz="6" w:space="0" w:color="CCCCCC"/>
+              <w:left w:val="single" w:sz="6" w:space="0" w:color="CCCCCC"/>
+              <w:bottom w:val="single" w:sz="6" w:space="0" w:color="CCCCCC"/>
+              <w:right w:val="single" w:sz="6" w:space="0" w:color="CCCCCC"/>
+            </w:tcBorders>
+            <w:shd w:val="clear" w:color="auto" w:fill="F9F9F9"/>
+            <w:tcMar>
+              <w:top w:w="80" w:type="dxa"/>
+              <w:left w:w="120" w:type="dxa"/>
+              <w:bottom w:w="80" w:type="dxa"/>
+              <w:right w:w="120" w:type="dxa"/>
+            </w:tcMar>
+          </w:tcPr>
+          <w:p>
+            <w:pPr>
+              <w:spacing w:before="40" w:after="40"/>
+              <w:jc w:val="both"/>
+            </w:pPr>
+            <w:r>
+              <w:rPr>
+                <w:color w:val="000000"/>
+                <w:sz w:val="17"/>
+                <w:szCs w:val="17"/>
+              </w:rPr>
+              <w:t>Data: BEI, OJK, Bibit untuk pemilihan instrumen; Cek DES terkini</w:t>
+            </w:r>
+          </w:p>
+        </w:tc>
+        <w:tc>
+          <w:tcPr>
+            <w:tcW w:w="1250" w:type="dxa"/>
+            <w:tcBorders>
+              <w:top w:val="single" w:sz="6" w:space="0" w:color="CCCCCC"/>
+              <w:left w:val="single" w:sz="6" w:space="0" w:color="CCCCCC"/>
+              <w:bottom w:val="single" w:sz="6" w:space="0" w:color="CCCCCC"/>
+              <w:right w:val="single" w:sz="6" w:space="0" w:color="CCCCCC"/>
+            </w:tcBorders>
+            <w:shd w:val="clear" w:color="auto" w:fill="F9F9F9"/>
+            <w:tcMar>
+              <w:top w:w="80" w:type="dxa"/>
+              <w:left w:w="120" w:type="dxa"/>
+              <w:bottom w:w="80" w:type="dxa"/>
+              <w:right w:w="120" w:type="dxa"/>
+            </w:tcMar>
+          </w:tcPr>
+          <w:p>
+            <w:pPr>
+              <w:spacing w:before="40" w:after="40"/>
+              <w:jc w:val="both"/>
+            </w:pPr>
+            <w:r>
+              <w:rPr>
+                <w:color w:val="000000"/>
+                <w:sz w:val="17"/>
+                <w:szCs w:val="17"/>
+              </w:rPr>
+              <w:t xml:space="preserve">Draft Portofolio Rp10 juta: 4 instrumen (saham, sukuk, reksa dana, emas) + justifikasi </w:t>
+            </w:r>
+            <w:r>
+              <w:rPr>
+                <w:color w:val="000000"/>
+                <w:sz w:val="17"/>
+                <w:szCs w:val="17"/>
+              </w:rPr>
+              <w:lastRenderedPageBreak/>
+              <w:t>syariah setiap instrumen (5%)</w:t>
+            </w:r>
+          </w:p>
+        </w:tc>
+        <w:tc>
+          <w:tcPr>
+            <w:tcW w:w="1000" w:type="dxa"/>
+            <w:tcBorders>
+              <w:top w:val="single" w:sz="6" w:space="0" w:color="CCCCCC"/>
+              <w:left w:val="single" w:sz="6" w:space="0" w:color="CCCCCC"/>
+              <w:bottom w:val="single" w:sz="6" w:space="0" w:color="CCCCCC"/>
+              <w:right w:val="single" w:sz="6" w:space="0" w:color="CCCCCC"/>
+            </w:tcBorders>
+            <w:shd w:val="clear" w:color="auto" w:fill="F9F9F9"/>
+            <w:tcMar>
+              <w:top w:w="80" w:type="dxa"/>
+              <w:left w:w="120" w:type="dxa"/>
+              <w:bottom w:w="80" w:type="dxa"/>
+              <w:right w:w="120" w:type="dxa"/>
+            </w:tcMar>
+          </w:tcPr>
+          <w:p>
+            <w:pPr>
+              <w:spacing w:before="40" w:after="40"/>
+              <w:jc w:val="both"/>
+            </w:pPr>
+            <w:r>
+              <w:rPr>
+                <w:color w:val="000000"/>
+                <w:sz w:val="17"/>
+                <w:szCs w:val="17"/>
+              </w:rPr>
+              <w:lastRenderedPageBreak/>
+              <w:t xml:space="preserve">Diversifikasi Islam: tawarruk; MPT Markowitz; Risk-return; Korelasi aset; Asset </w:t>
+            </w:r>
+            <w:r>
+              <w:rPr>
+                <w:color w:val="000000"/>
+                <w:sz w:val="17"/>
+                <w:szCs w:val="17"/>
+              </w:rPr>
+              <w:lastRenderedPageBreak/>
+              <w:t>allocation; Rebalancing; Emas sebagai safe haven Islami</w:t>
+            </w:r>
+          </w:p>
+        </w:tc>
+        <w:tc>
+          <w:tcPr>
+            <w:tcW w:w="400" w:type="dxa"/>
+            <w:tcBorders>
+              <w:top w:val="single" w:sz="6" w:space="0" w:color="CCCCCC"/>
+              <w:left w:val="single" w:sz="6" w:space="0" w:color="CCCCCC"/>
+              <w:bottom w:val="single" w:sz="6" w:space="0" w:color="CCCCCC"/>
+              <w:right w:val="single" w:sz="6" w:space="0" w:color="CCCCCC"/>
+            </w:tcBorders>
+            <w:shd w:val="clear" w:color="auto" w:fill="F9F9F9"/>
+            <w:tcMar>
+              <w:top w:w="80" w:type="dxa"/>
+              <w:left w:w="120" w:type="dxa"/>
+              <w:bottom w:w="80" w:type="dxa"/>
+              <w:right w:w="120" w:type="dxa"/>
+            </w:tcMar>
+            <w:vAlign w:val="center"/>
+          </w:tcPr>
+          <w:p>
+            <w:pPr>
+              <w:spacing w:before="40" w:after="40"/>
+              <w:jc w:val="center"/>
+            </w:pPr>
+            <w:r>
+              <w:rPr>
+                <w:color w:val="000000"/>
+                <w:sz w:val="18"/>
+                <w:szCs w:val="18"/>
+              </w:rPr>
+              <w:lastRenderedPageBreak/>
               <w:t>8%</w:t>
             </w:r>
           </w:p>
@@ -10360,7 +10338,6 @@
                 <w:sz w:val="20"/>
                 <w:szCs w:val="20"/>
               </w:rPr>
-              <w:lastRenderedPageBreak/>
               <w:t>12</w:t>
             </w:r>
           </w:p>
@@ -10761,7 +10738,16 @@
                 <w:sz w:val="18"/>
                 <w:szCs w:val="18"/>
               </w:rPr>
-              <w:t>Workshop I — Mahasiswa menyusun Proposal Portofolio Investasi Syariah Rp50 juta hipotetis berbasis data riil. [Sub-CPMK 12, CPMK-5]</w:t>
+              <w:t xml:space="preserve">Workshop I — Mahasiswa menyusun Proposal Portofolio Investasi Syariah Rp50 juta hipotetis berbasis </w:t>
+            </w:r>
+            <w:r>
+              <w:rPr>
+                <w:color w:val="000000"/>
+                <w:sz w:val="18"/>
+                <w:szCs w:val="18"/>
+              </w:rPr>
+              <w:lastRenderedPageBreak/>
+              <w:t>data riil. [Sub-CPMK 12, CPMK-5]</w:t>
             </w:r>
           </w:p>
         </w:tc>
@@ -10793,6 +10779,7 @@
                 <w:sz w:val="17"/>
                 <w:szCs w:val="17"/>
               </w:rPr>
+              <w:lastRenderedPageBreak/>
               <w:t>Kelengkapan komponen proposal (min. 5 instrumen)</w:t>
             </w:r>
           </w:p>
@@ -10821,6 +10808,7 @@
                 <w:sz w:val="17"/>
                 <w:szCs w:val="17"/>
               </w:rPr>
+              <w:lastRenderedPageBreak/>
               <w:t>Justifikasi syariah setiap instrumen</w:t>
             </w:r>
           </w:p>
@@ -10853,6 +10841,7 @@
                 <w:sz w:val="17"/>
                 <w:szCs w:val="17"/>
               </w:rPr>
+              <w:lastRenderedPageBreak/>
               <w:t>Kriteria: Kelengkapan (30%); Kualitas analisis data riil (40%); Justifikasi syariah (30%)</w:t>
             </w:r>
           </w:p>
@@ -10867,6 +10856,7 @@
                 <w:sz w:val="17"/>
                 <w:szCs w:val="17"/>
               </w:rPr>
+              <w:lastRenderedPageBreak/>
               <w:t>Teknik: Workshop + Coaching</w:t>
             </w:r>
           </w:p>
@@ -10899,6 +10889,7 @@
                 <w:sz w:val="17"/>
                 <w:szCs w:val="17"/>
               </w:rPr>
+              <w:lastRenderedPageBreak/>
               <w:t>Workshop kelompok: penyusunan proposal portofolio</w:t>
             </w:r>
           </w:p>
@@ -11861,7 +11852,6 @@
                 <w:sz w:val="20"/>
                 <w:szCs w:val="20"/>
               </w:rPr>
-              <w:lastRenderedPageBreak/>
               <w:t>16</w:t>
             </w:r>
           </w:p>
@@ -12227,7 +12217,7 @@
           <w:left w:w="10" w:type="dxa"/>
           <w:right w:w="10" w:type="dxa"/>
         </w:tblCellMar>
-        <w:tblLook w:val="04A0" w:firstRow="1" w:lastRow="0" w:firstColumn="1" w:lastColumn="0" w:noHBand="0" w:noVBand="1"/>
+        <w:tblLook w:val="0000" w:firstRow="0" w:lastRow="0" w:firstColumn="0" w:lastColumn="0" w:noHBand="0" w:noVBand="0"/>
       </w:tblPr>
       <w:tblGrid>
         <w:gridCol w:w="2000"/>
@@ -12418,6 +12408,7 @@
                 <w:sz w:val="20"/>
                 <w:szCs w:val="20"/>
               </w:rPr>
+              <w:lastRenderedPageBreak/>
               <w:t>Kehadiran &amp; Partisipasi</w:t>
             </w:r>
           </w:p>
@@ -13262,6 +13253,72 @@
     </w:p>
     <w:p>
       <w:pPr>
+        <w:spacing w:after="60"/>
+      </w:pPr>
+      <w:r>
+        <w:rPr>
+          <w:sz w:val="20"/>
+        </w:rPr>
+        <w:t>1. Kehadiran minimal 75% dari total pertemuan menjadi syarat mengikuti Ujian Akhir Semester (UAS).</w:t>
+      </w:r>
+    </w:p>
+    <w:p>
+      <w:pPr>
+        <w:spacing w:after="60"/>
+      </w:pPr>
+      <w:r>
+        <w:rPr>
+          <w:sz w:val="20"/>
+        </w:rPr>
+        <w:t>2. Skala nilai akhir: A (80–100), B (70–79,99), C (60–69,99), D (50–59,99), E (&lt;50). Nilai kelulusan minimal C.</w:t>
+      </w:r>
+    </w:p>
+    <w:p>
+      <w:pPr>
+        <w:spacing w:after="60"/>
+      </w:pPr>
+      <w:r>
+        <w:rPr>
+          <w:sz w:val="20"/>
+        </w:rPr>
+        <w:t>3. Keterlambatan pengumpulan tugas dikenai pengurangan nilai 10% per hari (maksimal 3 hari); melewati batas tersebut tugas dinilai 0.</w:t>
+      </w:r>
+    </w:p>
+    <w:p>
+      <w:pPr>
+        <w:spacing w:after="60"/>
+      </w:pPr>
+      <w:r>
+        <w:rPr>
+          <w:sz w:val="20"/>
+        </w:rPr>
+        <w:t>4. Plagiarisme dan segala bentuk kecurangan akademik berakibat nilai 0 pada komponen terkait dan diproses sesuai kode etik STEI Fitrah Insani.</w:t>
+      </w:r>
+    </w:p>
+    <w:p>
+      <w:pPr>
+        <w:spacing w:after="60"/>
+      </w:pPr>
+      <w:r>
+        <w:rPr>
+          <w:sz w:val="20"/>
+        </w:rPr>
+        <w:t>5. Mahasiswa dengan nilai akhir D atau E dapat mengikuti program remedial sesuai kalender akademik.</w:t>
+      </w:r>
+    </w:p>
+    <w:p>
+      <w:pPr>
+        <w:spacing w:after="60"/>
+      </w:pPr>
+      <w:r>
+        <w:rPr>
+          <w:sz w:val="20"/>
+        </w:rPr>
+        <w:t>6. Rekapitulasi nilai mengikuti tabel evaluasi pembelajaran; keputusan akhir dosen pengampu bersifat final setelah verifikasi Ketua Program Studi.</w:t>
+      </w:r>
+    </w:p>
+    <w:p>
+      <w:pPr>
         <w:spacing w:after="200"/>
       </w:pPr>
     </w:p>
@@ -13304,7 +13361,7 @@
           <w:left w:w="10" w:type="dxa"/>
           <w:right w:w="10" w:type="dxa"/>
         </w:tblCellMar>
-        <w:tblLook w:val="04A0" w:firstRow="1" w:lastRow="0" w:firstColumn="1" w:lastColumn="0" w:noHBand="0" w:noVBand="1"/>
+        <w:tblLook w:val="0000" w:firstRow="0" w:lastRow="0" w:firstColumn="0" w:lastColumn="0" w:noHBand="0" w:noVBand="0"/>
       </w:tblPr>
       <w:tblGrid>
         <w:gridCol w:w="1500"/>
@@ -13501,7 +13558,6 @@
                 <w:sz w:val="20"/>
                 <w:szCs w:val="20"/>
               </w:rPr>
-              <w:lastRenderedPageBreak/>
               <w:t>Wajib</w:t>
             </w:r>
           </w:p>
@@ -13727,6 +13783,7 @@
                 <w:sz w:val="20"/>
                 <w:szCs w:val="20"/>
               </w:rPr>
+              <w:lastRenderedPageBreak/>
               <w:t>Fatwa</w:t>
             </w:r>
           </w:p>
@@ -14060,7 +14117,7 @@
           <w:left w:w="10" w:type="dxa"/>
           <w:right w:w="10" w:type="dxa"/>
         </w:tblCellMar>
-        <w:tblLook w:val="04A0" w:firstRow="1" w:lastRow="0" w:firstColumn="1" w:lastColumn="0" w:noHBand="0" w:noVBand="1"/>
+        <w:tblLook w:val="0000" w:firstRow="0" w:lastRow="0" w:firstColumn="0" w:lastColumn="0" w:noHBand="0" w:noVBand="0"/>
       </w:tblPr>
       <w:tblGrid>
         <w:gridCol w:w="3066"/>
@@ -14402,7 +14459,7 @@
       <w:headerReference w:type="default" r:id="rId8"/>
       <w:footerReference w:type="default" r:id="rId9"/>
       <w:pgSz w:w="11906" w:h="16838"/>
-      <w:pgMar w:top="1260" w:right="1080" w:bottom="1260" w:left="1440" w:header="708" w:footer="708" w:gutter="0"/>
+      <w:pgMar w:top="1260" w:right="1080" w:bottom="1260" w:left="1440" w:header="504" w:footer="708" w:gutter="0"/>
       <w:cols w:space="720"/>
       <w:docGrid w:linePitch="360"/>
     </w:sectPr>
@@ -14411,7 +14468,7 @@
 </file>
 
 <file path=word/endnotes.xml><?xml version="1.0" encoding="utf-8"?>
-<w:endnotes xmlns:wpc="http://schemas.microsoft.com/office/word/2010/wordprocessingCanvas" xmlns:cx="http://schemas.microsoft.com/office/drawing/2014/chartex" xmlns:cx1="http://schemas.microsoft.com/office/drawing/2015/9/8/chartex" xmlns:cx2="http://schemas.microsoft.com/office/drawing/2015/10/21/chartex" xmlns:cx3="http://schemas.microsoft.com/office/drawing/2016/5/9/chartex" xmlns:cx4="http://schemas.microsoft.com/office/drawing/2016/5/10/chartex" xmlns:cx5="http://schemas.microsoft.com/office/drawing/2016/5/11/chartex" xmlns:cx6="http://schemas.microsoft.com/office/drawing/2016/5/12/chartex" xmlns:cx7="http://schemas.microsoft.com/office/drawing/2016/5/13/chartex" xmlns:cx8="http://schemas.microsoft.com/office/drawing/2016/5/14/chartex" xmlns:mc="http://schemas.openxmlformats.org/markup-compatibility/2006" xmlns:aink="http://schemas.microsoft.com/office/drawing/2016/ink" xmlns:am3d="http://schemas.microsoft.com/office/drawing/2017/model3d" xmlns:o="urn:schemas-microsoft-com:office:office" xmlns:oel="http://schemas.microsoft.com/office/2019/extlst" xmlns:r="http://schemas.openxmlformats.org/officeDocument/2006/relationships" xmlns:m="http://schemas.openxmlformats.org/officeDocument/2006/math" xmlns:v="urn:schemas-microsoft-com:vml" xmlns:wp14="http://schemas.microsoft.com/office/word/2010/wordprocessingDrawing" xmlns:wp="http://schemas.openxmlformats.org/drawingml/2006/wordprocessingDrawing" xmlns:w10="urn:schemas-microsoft-com:office:word" xmlns:w="http://schemas.openxmlformats.org/wordprocessingml/2006/main" xmlns:w14="http://schemas.microsoft.com/office/word/2010/wordml" xmlns:w15="http://schemas.microsoft.com/office/word/2012/wordml" xmlns:w16cei="http://schemas.microsoft.com/office/word/2026/wordml/cei" xmlns:w16cex="http://schemas.microsoft.com/office/word/2018/wordml/cex" xmlns:w16cid="http://schemas.microsoft.com/office/word/2016/wordml/cid" xmlns:w16="http://schemas.microsoft.com/office/word/2018/wordml" xmlns:w16du="http://schemas.microsoft.com/office/word/2023/wordml/word16du" xmlns:w16sdtdh="http://schemas.microsoft.com/office/word/2020/wordml/sdtdatahash" xmlns:w16sdtfl="http://schemas.microsoft.com/office/word/2024/wordml/sdtformatlock" xmlns:w16se="http://schemas.microsoft.com/office/word/2015/wordml/symex" xmlns:wpg="http://schemas.microsoft.com/office/word/2010/wordprocessingGroup" xmlns:wpi="http://schemas.microsoft.com/office/word/2010/wordprocessingInk" xmlns:wne="http://schemas.microsoft.com/office/word/2006/wordml" xmlns:wps="http://schemas.microsoft.com/office/word/2010/wordprocessingShape" mc:Ignorable="w14 w15 w16se w16cid w16 w16cex w16sdtdh w16sdtfl w16du wp14">
+<w:endnotes xmlns:wpc="http://schemas.microsoft.com/office/word/2010/wordprocessingCanvas" xmlns:cx="http://schemas.microsoft.com/office/drawing/2014/chartex" xmlns:cx1="http://schemas.microsoft.com/office/drawing/2015/9/8/chartex" xmlns:cx2="http://schemas.microsoft.com/office/drawing/2015/10/21/chartex" xmlns:cx3="http://schemas.microsoft.com/office/drawing/2016/5/9/chartex" xmlns:cx4="http://schemas.microsoft.com/office/drawing/2016/5/10/chartex" xmlns:cx5="http://schemas.microsoft.com/office/drawing/2016/5/11/chartex" xmlns:cx6="http://schemas.microsoft.com/office/drawing/2016/5/12/chartex" xmlns:cx7="http://schemas.microsoft.com/office/drawing/2016/5/13/chartex" xmlns:cx8="http://schemas.microsoft.com/office/drawing/2016/5/14/chartex" xmlns:mc="http://schemas.openxmlformats.org/markup-compatibility/2006" xmlns:aink="http://schemas.microsoft.com/office/drawing/2016/ink" xmlns:am3d="http://schemas.microsoft.com/office/drawing/2017/model3d" xmlns:o="urn:schemas-microsoft-com:office:office" xmlns:oel="http://schemas.microsoft.com/office/2019/extlst" xmlns:r="http://schemas.openxmlformats.org/officeDocument/2006/relationships" xmlns:m="http://schemas.openxmlformats.org/officeDocument/2006/math" xmlns:v="urn:schemas-microsoft-com:vml" xmlns:wp14="http://schemas.microsoft.com/office/word/2010/wordprocessingDrawing" xmlns:wp="http://schemas.openxmlformats.org/drawingml/2006/wordprocessingDrawing" xmlns:w10="urn:schemas-microsoft-com:office:word" xmlns:w="http://schemas.openxmlformats.org/wordprocessingml/2006/main" xmlns:w14="http://schemas.microsoft.com/office/word/2010/wordml" xmlns:w15="http://schemas.microsoft.com/office/word/2012/wordml" xmlns:w16cex="http://schemas.microsoft.com/office/word/2018/wordml/cex" xmlns:w16cid="http://schemas.microsoft.com/office/word/2016/wordml/cid" xmlns:w16="http://schemas.microsoft.com/office/word/2018/wordml" xmlns:w16du="http://schemas.microsoft.com/office/word/2023/wordml/word16du" xmlns:w16sdtdh="http://schemas.microsoft.com/office/word/2020/wordml/sdtdatahash" xmlns:w16sdtfl="http://schemas.microsoft.com/office/word/2024/wordml/sdtformatlock" xmlns:w16se="http://schemas.microsoft.com/office/word/2015/wordml/symex" xmlns:wpg="http://schemas.microsoft.com/office/word/2010/wordprocessingGroup" xmlns:wpi="http://schemas.microsoft.com/office/word/2010/wordprocessingInk" xmlns:wne="http://schemas.microsoft.com/office/word/2006/wordml" xmlns:wps="http://schemas.microsoft.com/office/word/2010/wordprocessingShape" mc:Ignorable="w14 w15 w16se w16cid w16 w16cex w16sdtdh w16sdtfl w16du wp14">
   <w:endnote w:type="separator" w:id="-1">
     <w:p>
       <w:r>
@@ -14430,7 +14487,7 @@
 </file>
 
 <file path=word/footer1.xml><?xml version="1.0" encoding="utf-8"?>
-<w:ftr xmlns:wpc="http://schemas.microsoft.com/office/word/2010/wordprocessingCanvas" xmlns:cx="http://schemas.microsoft.com/office/drawing/2014/chartex" xmlns:cx1="http://schemas.microsoft.com/office/drawing/2015/9/8/chartex" xmlns:cx2="http://schemas.microsoft.com/office/drawing/2015/10/21/chartex" xmlns:cx3="http://schemas.microsoft.com/office/drawing/2016/5/9/chartex" xmlns:cx4="http://schemas.microsoft.com/office/drawing/2016/5/10/chartex" xmlns:cx5="http://schemas.microsoft.com/office/drawing/2016/5/11/chartex" xmlns:cx6="http://schemas.microsoft.com/office/drawing/2016/5/12/chartex" xmlns:cx7="http://schemas.microsoft.com/office/drawing/2016/5/13/chartex" xmlns:cx8="http://schemas.microsoft.com/office/drawing/2016/5/14/chartex" xmlns:mc="http://schemas.openxmlformats.org/markup-compatibility/2006" xmlns:aink="http://schemas.microsoft.com/office/drawing/2016/ink" xmlns:am3d="http://schemas.microsoft.com/office/drawing/2017/model3d" xmlns:o="urn:schemas-microsoft-com:office:office" xmlns:oel="http://schemas.microsoft.com/office/2019/extlst" xmlns:r="http://schemas.openxmlformats.org/officeDocument/2006/relationships" xmlns:m="http://schemas.openxmlformats.org/officeDocument/2006/math" xmlns:v="urn:schemas-microsoft-com:vml" xmlns:wp14="http://schemas.microsoft.com/office/word/2010/wordprocessingDrawing" xmlns:wp="http://schemas.openxmlformats.org/drawingml/2006/wordprocessingDrawing" xmlns:w10="urn:schemas-microsoft-com:office:word" xmlns:w="http://schemas.openxmlformats.org/wordprocessingml/2006/main" xmlns:w14="http://schemas.microsoft.com/office/word/2010/wordml" xmlns:w15="http://schemas.microsoft.com/office/word/2012/wordml" xmlns:w16cei="http://schemas.microsoft.com/office/word/2026/wordml/cei" xmlns:w16cex="http://schemas.microsoft.com/office/word/2018/wordml/cex" xmlns:w16cid="http://schemas.microsoft.com/office/word/2016/wordml/cid" xmlns:w16="http://schemas.microsoft.com/office/word/2018/wordml" xmlns:w16du="http://schemas.microsoft.com/office/word/2023/wordml/word16du" xmlns:w16sdtdh="http://schemas.microsoft.com/office/word/2020/wordml/sdtdatahash" xmlns:w16sdtfl="http://schemas.microsoft.com/office/word/2024/wordml/sdtformatlock" xmlns:w16se="http://schemas.microsoft.com/office/word/2015/wordml/symex" xmlns:wpg="http://schemas.microsoft.com/office/word/2010/wordprocessingGroup" xmlns:wpi="http://schemas.microsoft.com/office/word/2010/wordprocessingInk" xmlns:wne="http://schemas.microsoft.com/office/word/2006/wordml" xmlns:wps="http://schemas.microsoft.com/office/word/2010/wordprocessingShape" mc:Ignorable="w14 w15 w16se w16cid w16 w16cex w16sdtdh w16sdtfl w16du wp14">
+<w:ftr xmlns:wpc="http://schemas.microsoft.com/office/word/2010/wordprocessingCanvas" xmlns:cx="http://schemas.microsoft.com/office/drawing/2014/chartex" xmlns:cx1="http://schemas.microsoft.com/office/drawing/2015/9/8/chartex" xmlns:cx2="http://schemas.microsoft.com/office/drawing/2015/10/21/chartex" xmlns:cx3="http://schemas.microsoft.com/office/drawing/2016/5/9/chartex" xmlns:cx4="http://schemas.microsoft.com/office/drawing/2016/5/10/chartex" xmlns:cx5="http://schemas.microsoft.com/office/drawing/2016/5/11/chartex" xmlns:cx6="http://schemas.microsoft.com/office/drawing/2016/5/12/chartex" xmlns:cx7="http://schemas.microsoft.com/office/drawing/2016/5/13/chartex" xmlns:cx8="http://schemas.microsoft.com/office/drawing/2016/5/14/chartex" xmlns:mc="http://schemas.openxmlformats.org/markup-compatibility/2006" xmlns:aink="http://schemas.microsoft.com/office/drawing/2016/ink" xmlns:am3d="http://schemas.microsoft.com/office/drawing/2017/model3d" xmlns:o="urn:schemas-microsoft-com:office:office" xmlns:oel="http://schemas.microsoft.com/office/2019/extlst" xmlns:r="http://schemas.openxmlformats.org/officeDocument/2006/relationships" xmlns:m="http://schemas.openxmlformats.org/officeDocument/2006/math" xmlns:v="urn:schemas-microsoft-com:vml" xmlns:wp14="http://schemas.microsoft.com/office/word/2010/wordprocessingDrawing" xmlns:wp="http://schemas.openxmlformats.org/drawingml/2006/wordprocessingDrawing" xmlns:w10="urn:schemas-microsoft-com:office:word" xmlns:w="http://schemas.openxmlformats.org/wordprocessingml/2006/main" xmlns:w14="http://schemas.microsoft.com/office/word/2010/wordml" xmlns:w15="http://schemas.microsoft.com/office/word/2012/wordml" xmlns:w16cex="http://schemas.microsoft.com/office/word/2018/wordml/cex" xmlns:w16cid="http://schemas.microsoft.com/office/word/2016/wordml/cid" xmlns:w16="http://schemas.microsoft.com/office/word/2018/wordml" xmlns:w16du="http://schemas.microsoft.com/office/word/2023/wordml/word16du" xmlns:w16sdtdh="http://schemas.microsoft.com/office/word/2020/wordml/sdtdatahash" xmlns:w16sdtfl="http://schemas.microsoft.com/office/word/2024/wordml/sdtformatlock" xmlns:w16se="http://schemas.microsoft.com/office/word/2015/wordml/symex" xmlns:wpg="http://schemas.microsoft.com/office/word/2010/wordprocessingGroup" xmlns:wpi="http://schemas.microsoft.com/office/word/2010/wordprocessingInk" xmlns:wne="http://schemas.microsoft.com/office/word/2006/wordml" xmlns:wps="http://schemas.microsoft.com/office/word/2010/wordprocessingShape" mc:Ignorable="w14 w15 w16se w16cid w16 w16cex w16sdtdh w16sdtfl w16du wp14">
   <w:p>
     <w:pPr>
       <w:pBdr>
@@ -14550,7 +14607,7 @@
 </file>
 
 <file path=word/footnotes.xml><?xml version="1.0" encoding="utf-8"?>
-<w:footnotes xmlns:wpc="http://schemas.microsoft.com/office/word/2010/wordprocessingCanvas" xmlns:cx="http://schemas.microsoft.com/office/drawing/2014/chartex" xmlns:cx1="http://schemas.microsoft.com/office/drawing/2015/9/8/chartex" xmlns:cx2="http://schemas.microsoft.com/office/drawing/2015/10/21/chartex" xmlns:cx3="http://schemas.microsoft.com/office/drawing/2016/5/9/chartex" xmlns:cx4="http://schemas.microsoft.com/office/drawing/2016/5/10/chartex" xmlns:cx5="http://schemas.microsoft.com/office/drawing/2016/5/11/chartex" xmlns:cx6="http://schemas.microsoft.com/office/drawing/2016/5/12/chartex" xmlns:cx7="http://schemas.microsoft.com/office/drawing/2016/5/13/chartex" xmlns:cx8="http://schemas.microsoft.com/office/drawing/2016/5/14/chartex" xmlns:mc="http://schemas.openxmlformats.org/markup-compatibility/2006" xmlns:aink="http://schemas.microsoft.com/office/drawing/2016/ink" xmlns:am3d="http://schemas.microsoft.com/office/drawing/2017/model3d" xmlns:o="urn:schemas-microsoft-com:office:office" xmlns:oel="http://schemas.microsoft.com/office/2019/extlst" xmlns:r="http://schemas.openxmlformats.org/officeDocument/2006/relationships" xmlns:m="http://schemas.openxmlformats.org/officeDocument/2006/math" xmlns:v="urn:schemas-microsoft-com:vml" xmlns:wp14="http://schemas.microsoft.com/office/word/2010/wordprocessingDrawing" xmlns:wp="http://schemas.openxmlformats.org/drawingml/2006/wordprocessingDrawing" xmlns:w10="urn:schemas-microsoft-com:office:word" xmlns:w="http://schemas.openxmlformats.org/wordprocessingml/2006/main" xmlns:w14="http://schemas.microsoft.com/office/word/2010/wordml" xmlns:w15="http://schemas.microsoft.com/office/word/2012/wordml" xmlns:w16cei="http://schemas.microsoft.com/office/word/2026/wordml/cei" xmlns:w16cex="http://schemas.microsoft.com/office/word/2018/wordml/cex" xmlns:w16cid="http://schemas.microsoft.com/office/word/2016/wordml/cid" xmlns:w16="http://schemas.microsoft.com/office/word/2018/wordml" xmlns:w16du="http://schemas.microsoft.com/office/word/2023/wordml/word16du" xmlns:w16sdtdh="http://schemas.microsoft.com/office/word/2020/wordml/sdtdatahash" xmlns:w16sdtfl="http://schemas.microsoft.com/office/word/2024/wordml/sdtformatlock" xmlns:w16se="http://schemas.microsoft.com/office/word/2015/wordml/symex" xmlns:wpg="http://schemas.microsoft.com/office/word/2010/wordprocessingGroup" xmlns:wpi="http://schemas.microsoft.com/office/word/2010/wordprocessingInk" xmlns:wne="http://schemas.microsoft.com/office/word/2006/wordml" xmlns:wps="http://schemas.microsoft.com/office/word/2010/wordprocessingShape" mc:Ignorable="w14 w15 w16se w16cid w16 w16cex w16sdtdh w16sdtfl w16du wp14">
+<w:footnotes xmlns:wpc="http://schemas.microsoft.com/office/word/2010/wordprocessingCanvas" xmlns:cx="http://schemas.microsoft.com/office/drawing/2014/chartex" xmlns:cx1="http://schemas.microsoft.com/office/drawing/2015/9/8/chartex" xmlns:cx2="http://schemas.microsoft.com/office/drawing/2015/10/21/chartex" xmlns:cx3="http://schemas.microsoft.com/office/drawing/2016/5/9/chartex" xmlns:cx4="http://schemas.microsoft.com/office/drawing/2016/5/10/chartex" xmlns:cx5="http://schemas.microsoft.com/office/drawing/2016/5/11/chartex" xmlns:cx6="http://schemas.microsoft.com/office/drawing/2016/5/12/chartex" xmlns:cx7="http://schemas.microsoft.com/office/drawing/2016/5/13/chartex" xmlns:cx8="http://schemas.microsoft.com/office/drawing/2016/5/14/chartex" xmlns:mc="http://schemas.openxmlformats.org/markup-compatibility/2006" xmlns:aink="http://schemas.microsoft.com/office/drawing/2016/ink" xmlns:am3d="http://schemas.microsoft.com/office/drawing/2017/model3d" xmlns:o="urn:schemas-microsoft-com:office:office" xmlns:oel="http://schemas.microsoft.com/office/2019/extlst" xmlns:r="http://schemas.openxmlformats.org/officeDocument/2006/relationships" xmlns:m="http://schemas.openxmlformats.org/officeDocument/2006/math" xmlns:v="urn:schemas-microsoft-com:vml" xmlns:wp14="http://schemas.microsoft.com/office/word/2010/wordprocessingDrawing" xmlns:wp="http://schemas.openxmlformats.org/drawingml/2006/wordprocessingDrawing" xmlns:w10="urn:schemas-microsoft-com:office:word" xmlns:w="http://schemas.openxmlformats.org/wordprocessingml/2006/main" xmlns:w14="http://schemas.microsoft.com/office/word/2010/wordml" xmlns:w15="http://schemas.microsoft.com/office/word/2012/wordml" xmlns:w16cex="http://schemas.microsoft.com/office/word/2018/wordml/cex" xmlns:w16cid="http://schemas.microsoft.com/office/word/2016/wordml/cid" xmlns:w16="http://schemas.microsoft.com/office/word/2018/wordml" xmlns:w16du="http://schemas.microsoft.com/office/word/2023/wordml/word16du" xmlns:w16sdtdh="http://schemas.microsoft.com/office/word/2020/wordml/sdtdatahash" xmlns:w16sdtfl="http://schemas.microsoft.com/office/word/2024/wordml/sdtformatlock" xmlns:w16se="http://schemas.microsoft.com/office/word/2015/wordml/symex" xmlns:wpg="http://schemas.microsoft.com/office/word/2010/wordprocessingGroup" xmlns:wpi="http://schemas.microsoft.com/office/word/2010/wordprocessingInk" xmlns:wne="http://schemas.microsoft.com/office/word/2006/wordml" xmlns:wps="http://schemas.microsoft.com/office/word/2010/wordprocessingShape" mc:Ignorable="w14 w15 w16se w16cid w16 w16cex w16sdtdh w16sdtfl w16du wp14">
   <w:footnote w:type="separator" w:id="-1">
     <w:p>
       <w:r>
@@ -14569,142 +14626,66 @@
 </file>
 
 <file path=word/header1.xml><?xml version="1.0" encoding="utf-8"?>
-<w:hdr xmlns:wpc="http://schemas.microsoft.com/office/word/2010/wordprocessingCanvas" xmlns:cx="http://schemas.microsoft.com/office/drawing/2014/chartex" xmlns:cx1="http://schemas.microsoft.com/office/drawing/2015/9/8/chartex" xmlns:cx2="http://schemas.microsoft.com/office/drawing/2015/10/21/chartex" xmlns:cx3="http://schemas.microsoft.com/office/drawing/2016/5/9/chartex" xmlns:cx4="http://schemas.microsoft.com/office/drawing/2016/5/10/chartex" xmlns:cx5="http://schemas.microsoft.com/office/drawing/2016/5/11/chartex" xmlns:cx6="http://schemas.microsoft.com/office/drawing/2016/5/12/chartex" xmlns:cx7="http://schemas.microsoft.com/office/drawing/2016/5/13/chartex" xmlns:cx8="http://schemas.microsoft.com/office/drawing/2016/5/14/chartex" xmlns:mc="http://schemas.openxmlformats.org/markup-compatibility/2006" xmlns:aink="http://schemas.microsoft.com/office/drawing/2016/ink" xmlns:am3d="http://schemas.microsoft.com/office/drawing/2017/model3d" xmlns:o="urn:schemas-microsoft-com:office:office" xmlns:oel="http://schemas.microsoft.com/office/2019/extlst" xmlns:r="http://schemas.openxmlformats.org/officeDocument/2006/relationships" xmlns:m="http://schemas.openxmlformats.org/officeDocument/2006/math" xmlns:v="urn:schemas-microsoft-com:vml" xmlns:wp14="http://schemas.microsoft.com/office/word/2010/wordprocessingDrawing" xmlns:wp="http://schemas.openxmlformats.org/drawingml/2006/wordprocessingDrawing" xmlns:w10="urn:schemas-microsoft-com:office:word" xmlns:w="http://schemas.openxmlformats.org/wordprocessingml/2006/main" xmlns:w14="http://schemas.microsoft.com/office/word/2010/wordml" xmlns:w15="http://schemas.microsoft.com/office/word/2012/wordml" xmlns:w16cei="http://schemas.microsoft.com/office/word/2026/wordml/cei" xmlns:w16cex="http://schemas.microsoft.com/office/word/2018/wordml/cex" xmlns:w16cid="http://schemas.microsoft.com/office/word/2016/wordml/cid" xmlns:w16="http://schemas.microsoft.com/office/word/2018/wordml" xmlns:w16du="http://schemas.microsoft.com/office/word/2023/wordml/word16du" xmlns:w16sdtdh="http://schemas.microsoft.com/office/word/2020/wordml/sdtdatahash" xmlns:w16sdtfl="http://schemas.microsoft.com/office/word/2024/wordml/sdtformatlock" xmlns:w16se="http://schemas.microsoft.com/office/word/2015/wordml/symex" xmlns:wpg="http://schemas.microsoft.com/office/word/2010/wordprocessingGroup" xmlns:wpi="http://schemas.microsoft.com/office/word/2010/wordprocessingInk" xmlns:wne="http://schemas.microsoft.com/office/word/2006/wordml" xmlns:wps="http://schemas.microsoft.com/office/word/2010/wordprocessingShape" mc:Ignorable="w14 w15 w16se w16cid w16 w16cex w16sdtdh w16sdtfl w16du wp14">
+<w:hdr xmlns:wpc="http://schemas.microsoft.com/office/word/2010/wordprocessingCanvas" xmlns:cx="http://schemas.microsoft.com/office/drawing/2014/chartex" xmlns:cx1="http://schemas.microsoft.com/office/drawing/2015/9/8/chartex" xmlns:cx2="http://schemas.microsoft.com/office/drawing/2015/10/21/chartex" xmlns:cx3="http://schemas.microsoft.com/office/drawing/2016/5/9/chartex" xmlns:cx4="http://schemas.microsoft.com/office/drawing/2016/5/10/chartex" xmlns:cx5="http://schemas.microsoft.com/office/drawing/2016/5/11/chartex" xmlns:cx6="http://schemas.microsoft.com/office/drawing/2016/5/12/chartex" xmlns:cx7="http://schemas.microsoft.com/office/drawing/2016/5/13/chartex" xmlns:cx8="http://schemas.microsoft.com/office/drawing/2016/5/14/chartex" xmlns:mc="http://schemas.openxmlformats.org/markup-compatibility/2006" xmlns:aink="http://schemas.microsoft.com/office/drawing/2016/ink" xmlns:am3d="http://schemas.microsoft.com/office/drawing/2017/model3d" xmlns:o="urn:schemas-microsoft-com:office:office" xmlns:oel="http://schemas.microsoft.com/office/2019/extlst" xmlns:r="http://schemas.openxmlformats.org/officeDocument/2006/relationships" xmlns:m="http://schemas.openxmlformats.org/officeDocument/2006/math" xmlns:v="urn:schemas-microsoft-com:vml" xmlns:wp14="http://schemas.microsoft.com/office/word/2010/wordprocessingDrawing" xmlns:wp="http://schemas.openxmlformats.org/drawingml/2006/wordprocessingDrawing" xmlns:w10="urn:schemas-microsoft-com:office:word" xmlns:w="http://schemas.openxmlformats.org/wordprocessingml/2006/main" xmlns:w14="http://schemas.microsoft.com/office/word/2010/wordml" xmlns:w15="http://schemas.microsoft.com/office/word/2012/wordml" xmlns:w16cex="http://schemas.microsoft.com/office/word/2018/wordml/cex" xmlns:w16cid="http://schemas.microsoft.com/office/word/2016/wordml/cid" xmlns:w16="http://schemas.microsoft.com/office/word/2018/wordml" xmlns:w16du="http://schemas.microsoft.com/office/word/2023/wordml/word16du" xmlns:w16sdtdh="http://schemas.microsoft.com/office/word/2020/wordml/sdtdatahash" xmlns:w16sdtfl="http://schemas.microsoft.com/office/word/2024/wordml/sdtformatlock" xmlns:w16se="http://schemas.microsoft.com/office/word/2015/wordml/symex" xmlns:wpg="http://schemas.microsoft.com/office/word/2010/wordprocessingGroup" xmlns:wpi="http://schemas.microsoft.com/office/word/2010/wordprocessingInk" xmlns:wne="http://schemas.microsoft.com/office/word/2006/wordml" xmlns:wps="http://schemas.microsoft.com/office/word/2010/wordprocessingShape" mc:Ignorable="w14 w15 w16se w16cid w16 w16cex w16sdtdh w16sdtfl w16du wp14">
   <w:p>
     <w:pPr>
       <w:pBdr>
         <w:bottom w:val="single" w:sz="6" w:space="4" w:color="1B5E20"/>
       </w:pBdr>
-      <w:spacing w:after="60"/>
-      <w:jc w:val="right"/>
+      <w:spacing w:after="80"/>
+      <w:jc w:val="center"/>
     </w:pPr>
     <w:r>
       <w:rPr>
-        <w:color w:val="2E7D32"/>
-        <w:sz w:val="18"/>
-        <w:szCs w:val="18"/>
+        <w:noProof/>
       </w:rPr>
-      <w:t>RPS | Pasar Modal &amp; Investasi Syariah | MKI11321 | STEI FI | TA 2026/2027</w:t>
+      <w:drawing>
+        <wp:inline distT="0" distB="0" distL="0" distR="0" wp14:anchorId="05582581" wp14:editId="21A37D3D">
+          <wp:extent cx="5760720" cy="1089866"/>
+          <wp:effectExtent l="0" t="0" r="0" b="0"/>
+          <wp:docPr id="705333928" name="Picture 705333928"/>
+          <wp:cNvGraphicFramePr>
+            <a:graphicFrameLocks xmlns:a="http://schemas.openxmlformats.org/drawingml/2006/main" noChangeAspect="1"/>
+          </wp:cNvGraphicFramePr>
+          <a:graphic xmlns:a="http://schemas.openxmlformats.org/drawingml/2006/main">
+            <a:graphicData uri="http://schemas.openxmlformats.org/drawingml/2006/picture">
+              <pic:pic xmlns:pic="http://schemas.openxmlformats.org/drawingml/2006/picture">
+                <pic:nvPicPr>
+                  <pic:cNvPr id="0" name="KOP_STEI_FI.png"/>
+                  <pic:cNvPicPr/>
+                </pic:nvPicPr>
+                <pic:blipFill>
+                  <a:blip r:embed="rId1"/>
+                  <a:stretch>
+                    <a:fillRect/>
+                  </a:stretch>
+                </pic:blipFill>
+                <pic:spPr>
+                  <a:xfrm>
+                    <a:off x="0" y="0"/>
+                    <a:ext cx="5760720" cy="1089866"/>
+                  </a:xfrm>
+                  <a:prstGeom prst="rect">
+                    <a:avLst/>
+                  </a:prstGeom>
+                </pic:spPr>
+              </pic:pic>
+            </a:graphicData>
+          </a:graphic>
+        </wp:inline>
+      </w:drawing>
     </w:r>
   </w:p>
 </w:hdr>
 </file>
 
 <file path=word/numbering.xml><?xml version="1.0" encoding="utf-8"?>
-<w:numbering xmlns:wpc="http://schemas.microsoft.com/office/word/2010/wordprocessingCanvas" xmlns:cx="http://schemas.microsoft.com/office/drawing/2014/chartex" xmlns:cx1="http://schemas.microsoft.com/office/drawing/2015/9/8/chartex" xmlns:cx2="http://schemas.microsoft.com/office/drawing/2015/10/21/chartex" xmlns:cx3="http://schemas.microsoft.com/office/drawing/2016/5/9/chartex" xmlns:cx4="http://schemas.microsoft.com/office/drawing/2016/5/10/chartex" xmlns:cx5="http://schemas.microsoft.com/office/drawing/2016/5/11/chartex" xmlns:cx6="http://schemas.microsoft.com/office/drawing/2016/5/12/chartex" xmlns:cx7="http://schemas.microsoft.com/office/drawing/2016/5/13/chartex" xmlns:cx8="http://schemas.microsoft.com/office/drawing/2016/5/14/chartex" xmlns:mc="http://schemas.openxmlformats.org/markup-compatibility/2006" xmlns:aink="http://schemas.microsoft.com/office/drawing/2016/ink" xmlns:am3d="http://schemas.microsoft.com/office/drawing/2017/model3d" xmlns:o="urn:schemas-microsoft-com:office:office" xmlns:oel="http://schemas.microsoft.com/office/2019/extlst" xmlns:r="http://schemas.openxmlformats.org/officeDocument/2006/relationships" xmlns:m="http://schemas.openxmlformats.org/officeDocument/2006/math" xmlns:v="urn:schemas-microsoft-com:vml" xmlns:wp14="http://schemas.microsoft.com/office/word/2010/wordprocessingDrawing" xmlns:wp="http://schemas.openxmlformats.org/drawingml/2006/wordprocessingDrawing" xmlns:w10="urn:schemas-microsoft-com:office:word" xmlns:w="http://schemas.openxmlformats.org/wordprocessingml/2006/main" xmlns:w14="http://schemas.microsoft.com/office/word/2010/wordml" xmlns:w15="http://schemas.microsoft.com/office/word/2012/wordml" xmlns:w16cei="http://schemas.microsoft.com/office/word/2026/wordml/cei" xmlns:w16cex="http://schemas.microsoft.com/office/word/2018/wordml/cex" xmlns:w16cid="http://schemas.microsoft.com/office/word/2016/wordml/cid" xmlns:w16="http://schemas.microsoft.com/office/word/2018/wordml" xmlns:w16du="http://schemas.microsoft.com/office/word/2023/wordml/word16du" xmlns:w16sdtdh="http://schemas.microsoft.com/office/word/2020/wordml/sdtdatahash" xmlns:w16sdtfl="http://schemas.microsoft.com/office/word/2024/wordml/sdtformatlock" xmlns:w16se="http://schemas.microsoft.com/office/word/2015/wordml/symex" xmlns:wpg="http://schemas.microsoft.com/office/word/2010/wordprocessingGroup" xmlns:wpi="http://schemas.microsoft.com/office/word/2010/wordprocessingInk" xmlns:wne="http://schemas.microsoft.com/office/word/2006/wordml" xmlns:wps="http://schemas.microsoft.com/office/word/2010/wordprocessingShape" mc:Ignorable="w14 w15 w16se w16cid w16 w16cex w16sdtdh w16sdtfl w16du wp14">
+<w:numbering xmlns:wpc="http://schemas.microsoft.com/office/word/2010/wordprocessingCanvas" xmlns:cx="http://schemas.microsoft.com/office/drawing/2014/chartex" xmlns:cx1="http://schemas.microsoft.com/office/drawing/2015/9/8/chartex" xmlns:cx2="http://schemas.microsoft.com/office/drawing/2015/10/21/chartex" xmlns:cx3="http://schemas.microsoft.com/office/drawing/2016/5/9/chartex" xmlns:cx4="http://schemas.microsoft.com/office/drawing/2016/5/10/chartex" xmlns:cx5="http://schemas.microsoft.com/office/drawing/2016/5/11/chartex" xmlns:cx6="http://schemas.microsoft.com/office/drawing/2016/5/12/chartex" xmlns:cx7="http://schemas.microsoft.com/office/drawing/2016/5/13/chartex" xmlns:cx8="http://schemas.microsoft.com/office/drawing/2016/5/14/chartex" xmlns:mc="http://schemas.openxmlformats.org/markup-compatibility/2006" xmlns:aink="http://schemas.microsoft.com/office/drawing/2016/ink" xmlns:am3d="http://schemas.microsoft.com/office/drawing/2017/model3d" xmlns:o="urn:schemas-microsoft-com:office:office" xmlns:oel="http://schemas.microsoft.com/office/2019/extlst" xmlns:r="http://schemas.openxmlformats.org/officeDocument/2006/relationships" xmlns:m="http://schemas.openxmlformats.org/officeDocument/2006/math" xmlns:v="urn:schemas-microsoft-com:vml" xmlns:wp14="http://schemas.microsoft.com/office/word/2010/wordprocessingDrawing" xmlns:wp="http://schemas.openxmlformats.org/drawingml/2006/wordprocessingDrawing" xmlns:w10="urn:schemas-microsoft-com:office:word" xmlns:w="http://schemas.openxmlformats.org/wordprocessingml/2006/main" xmlns:w14="http://schemas.microsoft.com/office/word/2010/wordml" xmlns:w15="http://schemas.microsoft.com/office/word/2012/wordml" xmlns:w16cex="http://schemas.microsoft.com/office/word/2018/wordml/cex" xmlns:w16cid="http://schemas.microsoft.com/office/word/2016/wordml/cid" xmlns:w16="http://schemas.microsoft.com/office/word/2018/wordml" xmlns:w16du="http://schemas.microsoft.com/office/word/2023/wordml/word16du" xmlns:w16sdtdh="http://schemas.microsoft.com/office/word/2020/wordml/sdtdatahash" xmlns:w16sdtfl="http://schemas.microsoft.com/office/word/2024/wordml/sdtformatlock" xmlns:w16se="http://schemas.microsoft.com/office/word/2015/wordml/symex" xmlns:wpg="http://schemas.microsoft.com/office/word/2010/wordprocessingGroup" xmlns:wpi="http://schemas.microsoft.com/office/word/2010/wordprocessingInk" xmlns:wne="http://schemas.microsoft.com/office/word/2006/wordml" xmlns:wps="http://schemas.microsoft.com/office/word/2010/wordprocessingShape" mc:Ignorable="w14 w15 w16se w16cid w16 w16cex w16sdtdh w16sdtfl w16du wp14">
   <w:abstractNum w:abstractNumId="0" w15:restartNumberingAfterBreak="0">
-    <w:nsid w:val="2D375344"/>
+    <w:nsid w:val="4CAA69BC"/>
     <w:multiLevelType w:val="hybridMultilevel"/>
     <w:tmpl w:val="FFFFFFFF"/>
-    <w:lvl w:ilvl="0" w:tplc="62B8A836">
-      <w:start w:val="1"/>
-      <w:numFmt w:val="decimal"/>
-      <w:lvlText w:val="%1."/>
-      <w:lvlJc w:val="left"/>
-      <w:pPr>
-        <w:ind w:left="720" w:hanging="360"/>
-      </w:pPr>
-    </w:lvl>
-    <w:lvl w:ilvl="1" w:tplc="CAEAF038">
-      <w:numFmt w:val="decimal"/>
-      <w:lvlText w:val=""/>
-      <w:lvlJc w:val="left"/>
-    </w:lvl>
-    <w:lvl w:ilvl="2" w:tplc="1F66140A">
-      <w:numFmt w:val="decimal"/>
-      <w:lvlText w:val=""/>
-      <w:lvlJc w:val="left"/>
-    </w:lvl>
-    <w:lvl w:ilvl="3" w:tplc="36F4B77E">
-      <w:numFmt w:val="decimal"/>
-      <w:lvlText w:val=""/>
-      <w:lvlJc w:val="left"/>
-    </w:lvl>
-    <w:lvl w:ilvl="4" w:tplc="0430E104">
-      <w:numFmt w:val="decimal"/>
-      <w:lvlText w:val=""/>
-      <w:lvlJc w:val="left"/>
-    </w:lvl>
-    <w:lvl w:ilvl="5" w:tplc="DB7493CE">
-      <w:numFmt w:val="decimal"/>
-      <w:lvlText w:val=""/>
-      <w:lvlJc w:val="left"/>
-    </w:lvl>
-    <w:lvl w:ilvl="6" w:tplc="F37ED162">
-      <w:numFmt w:val="decimal"/>
-      <w:lvlText w:val=""/>
-      <w:lvlJc w:val="left"/>
-    </w:lvl>
-    <w:lvl w:ilvl="7" w:tplc="4FCA7C02">
-      <w:numFmt w:val="decimal"/>
-      <w:lvlText w:val=""/>
-      <w:lvlJc w:val="left"/>
-    </w:lvl>
-    <w:lvl w:ilvl="8" w:tplc="EB7C91DC">
-      <w:numFmt w:val="decimal"/>
-      <w:lvlText w:val=""/>
-      <w:lvlJc w:val="left"/>
-    </w:lvl>
-  </w:abstractNum>
-  <w:abstractNum w:abstractNumId="1" w15:restartNumberingAfterBreak="0">
-    <w:nsid w:val="6E533CCB"/>
-    <w:multiLevelType w:val="hybridMultilevel"/>
-    <w:tmpl w:val="FFFFFFFF"/>
-    <w:lvl w:ilvl="0" w:tplc="0076F8F2">
-      <w:start w:val="1"/>
-      <w:numFmt w:val="bullet"/>
-      <w:lvlText w:val="•"/>
-      <w:lvlJc w:val="left"/>
-      <w:pPr>
-        <w:ind w:left="720" w:hanging="360"/>
-      </w:pPr>
-    </w:lvl>
-    <w:lvl w:ilvl="1" w:tplc="FA7C24C2">
-      <w:numFmt w:val="decimal"/>
-      <w:lvlText w:val=""/>
-      <w:lvlJc w:val="left"/>
-    </w:lvl>
-    <w:lvl w:ilvl="2" w:tplc="8B46A486">
-      <w:numFmt w:val="decimal"/>
-      <w:lvlText w:val=""/>
-      <w:lvlJc w:val="left"/>
-    </w:lvl>
-    <w:lvl w:ilvl="3" w:tplc="2D602960">
-      <w:numFmt w:val="decimal"/>
-      <w:lvlText w:val=""/>
-      <w:lvlJc w:val="left"/>
-    </w:lvl>
-    <w:lvl w:ilvl="4" w:tplc="BF76CCD4">
-      <w:numFmt w:val="decimal"/>
-      <w:lvlText w:val=""/>
-      <w:lvlJc w:val="left"/>
-    </w:lvl>
-    <w:lvl w:ilvl="5" w:tplc="6A12AB7E">
-      <w:numFmt w:val="decimal"/>
-      <w:lvlText w:val=""/>
-      <w:lvlJc w:val="left"/>
-    </w:lvl>
-    <w:lvl w:ilvl="6" w:tplc="86529E2A">
-      <w:numFmt w:val="decimal"/>
-      <w:lvlText w:val=""/>
-      <w:lvlJc w:val="left"/>
-    </w:lvl>
-    <w:lvl w:ilvl="7" w:tplc="1C5A2CD2">
-      <w:numFmt w:val="decimal"/>
-      <w:lvlText w:val=""/>
-      <w:lvlJc w:val="left"/>
-    </w:lvl>
-    <w:lvl w:ilvl="8" w:tplc="CB7CD52E">
-      <w:numFmt w:val="decimal"/>
-      <w:lvlText w:val=""/>
-      <w:lvlJc w:val="left"/>
-    </w:lvl>
-  </w:abstractNum>
-  <w:abstractNum w:abstractNumId="2" w15:restartNumberingAfterBreak="0">
-    <w:nsid w:val="77D46290"/>
-    <w:multiLevelType w:val="hybridMultilevel"/>
-    <w:tmpl w:val="FFFFFFFF"/>
-    <w:lvl w:ilvl="0" w:tplc="123492E8">
+    <w:lvl w:ilvl="0" w:tplc="63E833AC">
       <w:start w:val="1"/>
       <w:numFmt w:val="bullet"/>
       <w:lvlText w:val="●"/>
@@ -14713,7 +14694,7 @@
         <w:ind w:left="720" w:hanging="360"/>
       </w:pPr>
     </w:lvl>
-    <w:lvl w:ilvl="1" w:tplc="5A3E626C">
+    <w:lvl w:ilvl="1" w:tplc="BC0CC340">
       <w:start w:val="1"/>
       <w:numFmt w:val="bullet"/>
       <w:lvlText w:val="○"/>
@@ -14722,7 +14703,7 @@
         <w:ind w:left="1440" w:hanging="360"/>
       </w:pPr>
     </w:lvl>
-    <w:lvl w:ilvl="2" w:tplc="66D44438">
+    <w:lvl w:ilvl="2" w:tplc="F8268BD0">
       <w:start w:val="1"/>
       <w:numFmt w:val="bullet"/>
       <w:lvlText w:val="■"/>
@@ -14731,7 +14712,7 @@
         <w:ind w:left="2160" w:hanging="360"/>
       </w:pPr>
     </w:lvl>
-    <w:lvl w:ilvl="3" w:tplc="636A51B4">
+    <w:lvl w:ilvl="3" w:tplc="325AFB96">
       <w:start w:val="1"/>
       <w:numFmt w:val="bullet"/>
       <w:lvlText w:val="●"/>
@@ -14740,7 +14721,7 @@
         <w:ind w:left="2880" w:hanging="360"/>
       </w:pPr>
     </w:lvl>
-    <w:lvl w:ilvl="4" w:tplc="C7081C60">
+    <w:lvl w:ilvl="4" w:tplc="38D46CA8">
       <w:start w:val="1"/>
       <w:numFmt w:val="bullet"/>
       <w:lvlText w:val="○"/>
@@ -14749,7 +14730,7 @@
         <w:ind w:left="3600" w:hanging="360"/>
       </w:pPr>
     </w:lvl>
-    <w:lvl w:ilvl="5" w:tplc="0F6E5DF2">
+    <w:lvl w:ilvl="5" w:tplc="D65E8458">
       <w:start w:val="1"/>
       <w:numFmt w:val="bullet"/>
       <w:lvlText w:val="■"/>
@@ -14758,7 +14739,7 @@
         <w:ind w:left="4320" w:hanging="360"/>
       </w:pPr>
     </w:lvl>
-    <w:lvl w:ilvl="6" w:tplc="973C51BE">
+    <w:lvl w:ilvl="6" w:tplc="B6764A4E">
       <w:start w:val="1"/>
       <w:numFmt w:val="bullet"/>
       <w:lvlText w:val="●"/>
@@ -14767,7 +14748,7 @@
         <w:ind w:left="5040" w:hanging="360"/>
       </w:pPr>
     </w:lvl>
-    <w:lvl w:ilvl="7" w:tplc="72C8DF86">
+    <w:lvl w:ilvl="7" w:tplc="1FB26F8A">
       <w:start w:val="1"/>
       <w:numFmt w:val="bullet"/>
       <w:lvlText w:val="●"/>
@@ -14776,7 +14757,7 @@
         <w:ind w:left="5760" w:hanging="360"/>
       </w:pPr>
     </w:lvl>
-    <w:lvl w:ilvl="8" w:tplc="B00AEF84">
+    <w:lvl w:ilvl="8" w:tplc="757ED372">
       <w:start w:val="1"/>
       <w:numFmt w:val="bullet"/>
       <w:lvlText w:val="●"/>
@@ -14786,14 +14767,122 @@
       </w:pPr>
     </w:lvl>
   </w:abstractNum>
-  <w:num w:numId="1" w16cid:durableId="1361855547">
-    <w:abstractNumId w:val="2"/>
+  <w:abstractNum w:abstractNumId="1" w15:restartNumberingAfterBreak="0">
+    <w:nsid w:val="501F7889"/>
+    <w:multiLevelType w:val="hybridMultilevel"/>
+    <w:tmpl w:val="FFFFFFFF"/>
+    <w:lvl w:ilvl="0" w:tplc="C3763B94">
+      <w:start w:val="1"/>
+      <w:numFmt w:val="bullet"/>
+      <w:lvlText w:val="•"/>
+      <w:lvlJc w:val="left"/>
+      <w:pPr>
+        <w:ind w:left="720" w:hanging="360"/>
+      </w:pPr>
+    </w:lvl>
+    <w:lvl w:ilvl="1" w:tplc="012404CA">
+      <w:numFmt w:val="decimal"/>
+      <w:lvlText w:val=""/>
+      <w:lvlJc w:val="left"/>
+    </w:lvl>
+    <w:lvl w:ilvl="2" w:tplc="334A26EC">
+      <w:numFmt w:val="decimal"/>
+      <w:lvlText w:val=""/>
+      <w:lvlJc w:val="left"/>
+    </w:lvl>
+    <w:lvl w:ilvl="3" w:tplc="754C52D2">
+      <w:numFmt w:val="decimal"/>
+      <w:lvlText w:val=""/>
+      <w:lvlJc w:val="left"/>
+    </w:lvl>
+    <w:lvl w:ilvl="4" w:tplc="9B963240">
+      <w:numFmt w:val="decimal"/>
+      <w:lvlText w:val=""/>
+      <w:lvlJc w:val="left"/>
+    </w:lvl>
+    <w:lvl w:ilvl="5" w:tplc="4CD640C2">
+      <w:numFmt w:val="decimal"/>
+      <w:lvlText w:val=""/>
+      <w:lvlJc w:val="left"/>
+    </w:lvl>
+    <w:lvl w:ilvl="6" w:tplc="BCE4EA32">
+      <w:numFmt w:val="decimal"/>
+      <w:lvlText w:val=""/>
+      <w:lvlJc w:val="left"/>
+    </w:lvl>
+    <w:lvl w:ilvl="7" w:tplc="3A369A5A">
+      <w:numFmt w:val="decimal"/>
+      <w:lvlText w:val=""/>
+      <w:lvlJc w:val="left"/>
+    </w:lvl>
+    <w:lvl w:ilvl="8" w:tplc="14BE1976">
+      <w:numFmt w:val="decimal"/>
+      <w:lvlText w:val=""/>
+      <w:lvlJc w:val="left"/>
+    </w:lvl>
+  </w:abstractNum>
+  <w:abstractNum w:abstractNumId="2" w15:restartNumberingAfterBreak="0">
+    <w:nsid w:val="54D40E7C"/>
+    <w:multiLevelType w:val="hybridMultilevel"/>
+    <w:tmpl w:val="FFFFFFFF"/>
+    <w:lvl w:ilvl="0" w:tplc="E132DA2C">
+      <w:start w:val="1"/>
+      <w:numFmt w:val="decimal"/>
+      <w:lvlText w:val="%1."/>
+      <w:lvlJc w:val="left"/>
+      <w:pPr>
+        <w:ind w:left="720" w:hanging="360"/>
+      </w:pPr>
+    </w:lvl>
+    <w:lvl w:ilvl="1" w:tplc="63BA42E0">
+      <w:numFmt w:val="decimal"/>
+      <w:lvlText w:val=""/>
+      <w:lvlJc w:val="left"/>
+    </w:lvl>
+    <w:lvl w:ilvl="2" w:tplc="EBA01258">
+      <w:numFmt w:val="decimal"/>
+      <w:lvlText w:val=""/>
+      <w:lvlJc w:val="left"/>
+    </w:lvl>
+    <w:lvl w:ilvl="3" w:tplc="19C4FA86">
+      <w:numFmt w:val="decimal"/>
+      <w:lvlText w:val=""/>
+      <w:lvlJc w:val="left"/>
+    </w:lvl>
+    <w:lvl w:ilvl="4" w:tplc="89CE4E30">
+      <w:numFmt w:val="decimal"/>
+      <w:lvlText w:val=""/>
+      <w:lvlJc w:val="left"/>
+    </w:lvl>
+    <w:lvl w:ilvl="5" w:tplc="F5CC18C2">
+      <w:numFmt w:val="decimal"/>
+      <w:lvlText w:val=""/>
+      <w:lvlJc w:val="left"/>
+    </w:lvl>
+    <w:lvl w:ilvl="6" w:tplc="5198B3AE">
+      <w:numFmt w:val="decimal"/>
+      <w:lvlText w:val=""/>
+      <w:lvlJc w:val="left"/>
+    </w:lvl>
+    <w:lvl w:ilvl="7" w:tplc="A7DAD310">
+      <w:numFmt w:val="decimal"/>
+      <w:lvlText w:val=""/>
+      <w:lvlJc w:val="left"/>
+    </w:lvl>
+    <w:lvl w:ilvl="8" w:tplc="C8A63E0C">
+      <w:numFmt w:val="decimal"/>
+      <w:lvlText w:val=""/>
+      <w:lvlJc w:val="left"/>
+    </w:lvl>
+  </w:abstractNum>
+  <w:num w:numId="1" w16cid:durableId="697126521">
+    <w:abstractNumId w:val="0"/>
     <w:lvlOverride w:ilvl="0">
       <w:startOverride w:val="1"/>
     </w:lvlOverride>
   </w:num>
-  <w:num w:numId="2" w16cid:durableId="69817112">
-    <w:abstractNumId w:val="0"/>
+  <w:num w:numId="2" w16cid:durableId="28072045">
+    <w:abstractNumId w:val="2"/>
     <w:lvlOverride w:ilvl="0">
       <w:startOverride w:val="1"/>
     </w:lvlOverride>

</xml_diff>